<commit_message>
update csv and excel sheets
</commit_message>
<xml_diff>
--- a/data/Metadata_EmergentVegCH4_L&O_2026.docx
+++ b/data/Metadata_EmergentVegCH4_L&O_2026.docx
@@ -3526,7 +3526,27 @@
                 <w:sz w:val="20"/>
                 <w:szCs w:val="20"/>
               </w:rPr>
-              <w:t xml:space="preserve">Bubble Trap Depth: Depth </w:t>
+              <w:t>Depth</w:t>
+            </w:r>
+            <w:r>
+              <w:rPr>
+                <w:rFonts w:asciiTheme="minorHAnsi" w:hAnsiTheme="minorHAnsi" w:cstheme="minorHAnsi"/>
+                <w:iCs/>
+                <w:color w:val="000000" w:themeColor="text1"/>
+                <w:sz w:val="20"/>
+                <w:szCs w:val="20"/>
+              </w:rPr>
+              <w:t>_BT</w:t>
+            </w:r>
+            <w:r>
+              <w:rPr>
+                <w:rFonts w:asciiTheme="minorHAnsi" w:hAnsiTheme="minorHAnsi" w:cstheme="minorHAnsi"/>
+                <w:iCs/>
+                <w:color w:val="000000" w:themeColor="text1"/>
+                <w:sz w:val="20"/>
+                <w:szCs w:val="20"/>
+              </w:rPr>
+              <w:t xml:space="preserve">: Depth </w:t>
             </w:r>
             <w:r>
               <w:rPr>
@@ -3808,10 +3828,7 @@
           <w:p>
             <w:pPr>
               <w:pStyle w:val="NormalWeb"/>
-              <w:numPr>
-                <w:ilvl w:val="0"/>
-                <w:numId w:val="4"/>
-              </w:numPr>
+              <w:ind w:left="142"/>
               <w:contextualSpacing/>
               <w:rPr>
                 <w:rFonts w:asciiTheme="minorHAnsi" w:hAnsiTheme="minorHAnsi" w:cstheme="minorHAnsi"/>
@@ -3821,68 +3838,6 @@
                 <w:szCs w:val="20"/>
               </w:rPr>
             </w:pPr>
-            <w:r>
-              <w:rPr>
-                <w:rFonts w:asciiTheme="minorHAnsi" w:hAnsiTheme="minorHAnsi" w:cstheme="minorHAnsi"/>
-                <w:iCs/>
-                <w:color w:val="000000" w:themeColor="text1"/>
-                <w:sz w:val="20"/>
-                <w:szCs w:val="20"/>
-              </w:rPr>
-              <w:t>Log Ebullitive CH</w:t>
-            </w:r>
-            <w:r>
-              <w:rPr>
-                <w:rFonts w:asciiTheme="minorHAnsi" w:hAnsiTheme="minorHAnsi" w:cstheme="minorHAnsi"/>
-                <w:iCs/>
-                <w:color w:val="000000" w:themeColor="text1"/>
-                <w:sz w:val="20"/>
-                <w:szCs w:val="20"/>
-                <w:vertAlign w:val="subscript"/>
-              </w:rPr>
-              <w:t>4</w:t>
-            </w:r>
-            <w:r>
-              <w:rPr>
-                <w:rFonts w:asciiTheme="minorHAnsi" w:hAnsiTheme="minorHAnsi" w:cstheme="minorHAnsi"/>
-                <w:iCs/>
-                <w:color w:val="000000" w:themeColor="text1"/>
-                <w:sz w:val="20"/>
-                <w:szCs w:val="20"/>
-              </w:rPr>
-              <w:t xml:space="preserve"> Flux: Log-transformed ebullitive flux (+ 1 to account for 0’s) </w:t>
-            </w:r>
-            <w:r>
-              <w:rPr>
-                <w:rFonts w:asciiTheme="minorHAnsi" w:hAnsiTheme="minorHAnsi" w:cstheme="minorHAnsi"/>
-                <w:iCs/>
-                <w:color w:val="000000" w:themeColor="text1"/>
-                <w:sz w:val="20"/>
-                <w:szCs w:val="20"/>
-              </w:rPr>
-              <w:t>using the calculated ebullitive flux featured in Ebullitive CH</w:t>
-            </w:r>
-            <w:r>
-              <w:rPr>
-                <w:rFonts w:asciiTheme="minorHAnsi" w:hAnsiTheme="minorHAnsi" w:cstheme="minorHAnsi"/>
-                <w:iCs/>
-                <w:color w:val="000000" w:themeColor="text1"/>
-                <w:sz w:val="20"/>
-                <w:szCs w:val="20"/>
-                <w:vertAlign w:val="subscript"/>
-              </w:rPr>
-              <w:t>4</w:t>
-            </w:r>
-            <w:r>
-              <w:rPr>
-                <w:rFonts w:asciiTheme="minorHAnsi" w:hAnsiTheme="minorHAnsi" w:cstheme="minorHAnsi"/>
-                <w:iCs/>
-                <w:color w:val="000000" w:themeColor="text1"/>
-                <w:sz w:val="20"/>
-                <w:szCs w:val="20"/>
-              </w:rPr>
-              <w:t xml:space="preserve"> Flux column.</w:t>
-            </w:r>
           </w:p>
         </w:tc>
       </w:tr>
@@ -4501,65 +4456,102 @@
           <w:p>
             <w:pPr>
               <w:pStyle w:val="NormalWeb"/>
-              <w:numPr>
-                <w:ilvl w:val="0"/>
-                <w:numId w:val="5"/>
-              </w:numPr>
+              <w:ind w:left="142"/>
               <w:contextualSpacing/>
               <w:rPr>
                 <w:rFonts w:asciiTheme="minorHAnsi" w:hAnsiTheme="minorHAnsi" w:cstheme="minorHAnsi"/>
+                <w:iCs/>
                 <w:color w:val="000000" w:themeColor="text1"/>
                 <w:sz w:val="20"/>
                 <w:szCs w:val="20"/>
               </w:rPr>
             </w:pPr>
-            <w:r>
-              <w:rPr>
-                <w:rFonts w:asciiTheme="minorHAnsi" w:hAnsiTheme="minorHAnsi" w:cstheme="minorHAnsi"/>
-                <w:color w:val="000000" w:themeColor="text1"/>
-                <w:sz w:val="20"/>
-                <w:szCs w:val="20"/>
-              </w:rPr>
-              <w:t>CH4 Flux</w:t>
-            </w:r>
-            <w:r>
-              <w:rPr>
-                <w:rFonts w:asciiTheme="minorHAnsi" w:hAnsiTheme="minorHAnsi" w:cstheme="minorHAnsi"/>
-                <w:color w:val="000000" w:themeColor="text1"/>
-                <w:sz w:val="20"/>
-                <w:szCs w:val="20"/>
-              </w:rPr>
-              <w:t xml:space="preserve">: </w:t>
-            </w:r>
-            <w:r>
-              <w:rPr>
-                <w:rFonts w:asciiTheme="minorHAnsi" w:hAnsiTheme="minorHAnsi" w:cstheme="minorHAnsi"/>
-                <w:color w:val="000000" w:themeColor="text1"/>
-                <w:sz w:val="20"/>
-                <w:szCs w:val="20"/>
-              </w:rPr>
-              <w:t>Chamber-based CH</w:t>
-            </w:r>
-            <w:r>
-              <w:rPr>
-                <w:rFonts w:asciiTheme="minorHAnsi" w:hAnsiTheme="minorHAnsi" w:cstheme="minorHAnsi"/>
-                <w:color w:val="000000" w:themeColor="text1"/>
-                <w:sz w:val="20"/>
-                <w:szCs w:val="20"/>
-                <w:vertAlign w:val="subscript"/>
-              </w:rPr>
-              <w:t>4</w:t>
-            </w:r>
-            <w:r>
-              <w:rPr>
-                <w:rFonts w:asciiTheme="minorHAnsi" w:hAnsiTheme="minorHAnsi" w:cstheme="minorHAnsi"/>
-                <w:color w:val="000000" w:themeColor="text1"/>
-                <w:sz w:val="20"/>
-                <w:szCs w:val="20"/>
-              </w:rPr>
-              <w:t xml:space="preserve"> flux calculated based on accumulated headspace concentrations over 30 minutes calculated based on the ideal gas law.</w:t>
-            </w:r>
-          </w:p>
+          </w:p>
+        </w:tc>
+      </w:tr>
+      <w:tr>
+        <w:trPr>
+          <w:jc w:val="center"/>
+        </w:trPr>
+        <w:tc>
+          <w:tcPr>
+            <w:tcW w:w="3268" w:type="dxa"/>
+            <w:vAlign w:val="center"/>
+          </w:tcPr>
+          <w:p>
+            <w:pPr>
+              <w:pStyle w:val="NormalWeb"/>
+              <w:contextualSpacing/>
+              <w:rPr>
+                <w:rFonts w:asciiTheme="minorHAnsi" w:hAnsiTheme="minorHAnsi" w:cstheme="minorHAnsi"/>
+                <w:b/>
+                <w:sz w:val="20"/>
+                <w:szCs w:val="20"/>
+              </w:rPr>
+            </w:pPr>
+            <w:r>
+              <w:rPr>
+                <w:rFonts w:asciiTheme="minorHAnsi" w:hAnsiTheme="minorHAnsi" w:cstheme="minorHAnsi"/>
+                <w:b/>
+                <w:sz w:val="20"/>
+                <w:szCs w:val="20"/>
+              </w:rPr>
+              <w:t>Laboratory, field, or other analytical methods –</w:t>
+            </w:r>
+          </w:p>
+          <w:p>
+            <w:pPr>
+              <w:pStyle w:val="NormalWeb"/>
+              <w:contextualSpacing/>
+              <w:rPr>
+                <w:rFonts w:asciiTheme="minorHAnsi" w:hAnsiTheme="minorHAnsi" w:cstheme="minorHAnsi"/>
+                <w:b/>
+                <w:i/>
+                <w:iCs/>
+                <w:sz w:val="20"/>
+                <w:szCs w:val="20"/>
+              </w:rPr>
+            </w:pPr>
+            <w:r>
+              <w:rPr>
+                <w:rFonts w:asciiTheme="minorHAnsi" w:hAnsiTheme="minorHAnsi" w:cstheme="minorHAnsi"/>
+                <w:b/>
+                <w:i/>
+                <w:iCs/>
+                <w:sz w:val="20"/>
+                <w:szCs w:val="20"/>
+              </w:rPr>
+              <w:t>Data4_</w:t>
+            </w:r>
+            <w:r>
+              <w:rPr>
+                <w:rFonts w:asciiTheme="minorHAnsi" w:hAnsiTheme="minorHAnsi" w:cstheme="minorHAnsi"/>
+                <w:b/>
+                <w:i/>
+                <w:iCs/>
+                <w:sz w:val="20"/>
+                <w:szCs w:val="20"/>
+              </w:rPr>
+              <w:t>EnvironmentalData</w:t>
+            </w:r>
+            <w:r>
+              <w:rPr>
+                <w:rFonts w:asciiTheme="minorHAnsi" w:hAnsiTheme="minorHAnsi" w:cstheme="minorHAnsi"/>
+                <w:b/>
+                <w:i/>
+                <w:iCs/>
+                <w:sz w:val="20"/>
+                <w:szCs w:val="20"/>
+              </w:rPr>
+              <w:t>.csv</w:t>
+            </w:r>
+          </w:p>
+        </w:tc>
+        <w:tc>
+          <w:tcPr>
+            <w:tcW w:w="6740" w:type="dxa"/>
+            <w:vAlign w:val="center"/>
+          </w:tcPr>
           <w:p>
             <w:pPr>
               <w:pStyle w:val="NormalWeb"/>
@@ -4570,103 +4562,13 @@
               <w:contextualSpacing/>
               <w:rPr>
                 <w:rFonts w:asciiTheme="minorHAnsi" w:hAnsiTheme="minorHAnsi" w:cstheme="minorHAnsi"/>
-                <w:i/>
-                <w:color w:val="FF0000"/>
-                <w:sz w:val="20"/>
-                <w:szCs w:val="20"/>
-              </w:rPr>
-            </w:pPr>
-            <w:r>
-              <w:rPr>
-                <w:rFonts w:asciiTheme="minorHAnsi" w:hAnsiTheme="minorHAnsi" w:cstheme="minorHAnsi"/>
-                <w:color w:val="000000" w:themeColor="text1"/>
-                <w:sz w:val="20"/>
-                <w:szCs w:val="20"/>
-              </w:rPr>
-              <w:t>Plant-Mediated CH</w:t>
-            </w:r>
-            <w:r>
-              <w:rPr>
-                <w:rFonts w:asciiTheme="minorHAnsi" w:hAnsiTheme="minorHAnsi" w:cstheme="minorHAnsi"/>
-                <w:color w:val="000000" w:themeColor="text1"/>
-                <w:sz w:val="20"/>
-                <w:szCs w:val="20"/>
-                <w:vertAlign w:val="subscript"/>
-              </w:rPr>
-              <w:t>4</w:t>
-            </w:r>
-            <w:r>
-              <w:rPr>
-                <w:rFonts w:asciiTheme="minorHAnsi" w:hAnsiTheme="minorHAnsi" w:cstheme="minorHAnsi"/>
-                <w:color w:val="000000" w:themeColor="text1"/>
-                <w:sz w:val="20"/>
-                <w:szCs w:val="20"/>
-              </w:rPr>
-              <w:t xml:space="preserve"> Flux</w:t>
-            </w:r>
-            <w:r>
-              <w:rPr>
-                <w:rFonts w:asciiTheme="minorHAnsi" w:hAnsiTheme="minorHAnsi" w:cstheme="minorHAnsi"/>
-                <w:color w:val="000000" w:themeColor="text1"/>
-                <w:sz w:val="20"/>
-                <w:szCs w:val="20"/>
-              </w:rPr>
-              <w:t xml:space="preserve">: </w:t>
-            </w:r>
-            <w:r>
-              <w:rPr>
-                <w:rFonts w:asciiTheme="minorHAnsi" w:hAnsiTheme="minorHAnsi" w:cstheme="minorHAnsi"/>
-                <w:color w:val="000000" w:themeColor="text1"/>
-                <w:sz w:val="20"/>
-                <w:szCs w:val="20"/>
-              </w:rPr>
-              <w:t>CH</w:t>
-            </w:r>
-            <w:r>
-              <w:rPr>
-                <w:rFonts w:asciiTheme="minorHAnsi" w:hAnsiTheme="minorHAnsi" w:cstheme="minorHAnsi"/>
-                <w:color w:val="000000" w:themeColor="text1"/>
-                <w:sz w:val="20"/>
-                <w:szCs w:val="20"/>
-                <w:vertAlign w:val="subscript"/>
-              </w:rPr>
-              <w:t>4</w:t>
-            </w:r>
-            <w:r>
-              <w:rPr>
-                <w:rFonts w:asciiTheme="minorHAnsi" w:hAnsiTheme="minorHAnsi" w:cstheme="minorHAnsi"/>
-                <w:color w:val="000000" w:themeColor="text1"/>
-                <w:sz w:val="20"/>
-                <w:szCs w:val="20"/>
-              </w:rPr>
-              <w:t xml:space="preserve"> flux from </w:t>
-            </w:r>
-            <w:r>
-              <w:rPr>
-                <w:rFonts w:asciiTheme="minorHAnsi" w:hAnsiTheme="minorHAnsi" w:cstheme="minorHAnsi"/>
-                <w:i/>
                 <w:iCs/>
                 <w:color w:val="000000" w:themeColor="text1"/>
                 <w:sz w:val="20"/>
                 <w:szCs w:val="20"/>
               </w:rPr>
-              <w:t>Carex</w:t>
-            </w:r>
-            <w:r>
-              <w:rPr>
-                <w:rFonts w:asciiTheme="minorHAnsi" w:hAnsiTheme="minorHAnsi" w:cstheme="minorHAnsi"/>
-                <w:color w:val="000000" w:themeColor="text1"/>
-                <w:sz w:val="20"/>
-                <w:szCs w:val="20"/>
-              </w:rPr>
-              <w:t xml:space="preserve"> species specifically estimated by the result of paired open-vegetated chamber-based fluxes being subtracted from each other. </w:t>
-            </w:r>
-          </w:p>
-          <w:p>
-            <w:pPr>
-              <w:pStyle w:val="NormalWeb"/>
-              <w:ind w:left="406"/>
-              <w:contextualSpacing/>
+            </w:pPr>
+            <w:r>
               <w:rPr>
                 <w:rFonts w:asciiTheme="minorHAnsi" w:hAnsiTheme="minorHAnsi" w:cstheme="minorHAnsi"/>
                 <w:iCs/>
@@ -4674,93 +4576,49 @@
                 <w:sz w:val="20"/>
                 <w:szCs w:val="20"/>
               </w:rPr>
-            </w:pPr>
-          </w:p>
-        </w:tc>
-      </w:tr>
-      <w:tr>
-        <w:trPr>
-          <w:jc w:val="center"/>
-        </w:trPr>
-        <w:tc>
-          <w:tcPr>
-            <w:tcW w:w="3268" w:type="dxa"/>
-            <w:vAlign w:val="center"/>
-          </w:tcPr>
-          <w:p>
-            <w:pPr>
-              <w:pStyle w:val="NormalWeb"/>
-              <w:contextualSpacing/>
-              <w:rPr>
-                <w:rFonts w:asciiTheme="minorHAnsi" w:hAnsiTheme="minorHAnsi" w:cstheme="minorHAnsi"/>
-                <w:b/>
-                <w:sz w:val="20"/>
-                <w:szCs w:val="20"/>
-              </w:rPr>
-            </w:pPr>
-            <w:r>
-              <w:rPr>
-                <w:rFonts w:asciiTheme="minorHAnsi" w:hAnsiTheme="minorHAnsi" w:cstheme="minorHAnsi"/>
-                <w:b/>
-                <w:sz w:val="20"/>
-                <w:szCs w:val="20"/>
-              </w:rPr>
-              <w:t>Laboratory, field, or other analytical methods –</w:t>
-            </w:r>
-          </w:p>
-          <w:p>
-            <w:pPr>
-              <w:pStyle w:val="NormalWeb"/>
-              <w:contextualSpacing/>
-              <w:rPr>
-                <w:rFonts w:asciiTheme="minorHAnsi" w:hAnsiTheme="minorHAnsi" w:cstheme="minorHAnsi"/>
-                <w:b/>
-                <w:i/>
+              <w:t>Depth</w:t>
+            </w:r>
+            <w:r>
+              <w:rPr>
+                <w:rFonts w:asciiTheme="minorHAnsi" w:hAnsiTheme="minorHAnsi" w:cstheme="minorHAnsi"/>
                 <w:iCs/>
-                <w:sz w:val="20"/>
-                <w:szCs w:val="20"/>
-              </w:rPr>
-            </w:pPr>
-            <w:r>
-              <w:rPr>
-                <w:rFonts w:asciiTheme="minorHAnsi" w:hAnsiTheme="minorHAnsi" w:cstheme="minorHAnsi"/>
-                <w:b/>
-                <w:i/>
+                <w:color w:val="000000" w:themeColor="text1"/>
+                <w:sz w:val="20"/>
+                <w:szCs w:val="20"/>
+              </w:rPr>
+              <w:t>_FC:</w:t>
+            </w:r>
+            <w:r>
+              <w:rPr>
+                <w:rFonts w:asciiTheme="minorHAnsi" w:hAnsiTheme="minorHAnsi" w:cstheme="minorHAnsi"/>
                 <w:iCs/>
-                <w:sz w:val="20"/>
-                <w:szCs w:val="20"/>
-              </w:rPr>
-              <w:t>Data4_</w:t>
-            </w:r>
-            <w:r>
-              <w:rPr>
-                <w:rFonts w:asciiTheme="minorHAnsi" w:hAnsiTheme="minorHAnsi" w:cstheme="minorHAnsi"/>
-                <w:b/>
-                <w:i/>
+                <w:color w:val="000000" w:themeColor="text1"/>
+                <w:sz w:val="20"/>
+                <w:szCs w:val="20"/>
+              </w:rPr>
+              <w:t xml:space="preserve"> </w:t>
+            </w:r>
+            <w:r>
+              <w:rPr>
+                <w:rFonts w:asciiTheme="minorHAnsi" w:hAnsiTheme="minorHAnsi" w:cstheme="minorHAnsi"/>
                 <w:iCs/>
-                <w:sz w:val="20"/>
-                <w:szCs w:val="20"/>
-              </w:rPr>
-              <w:t>EnvironmentalData</w:t>
-            </w:r>
-            <w:r>
-              <w:rPr>
-                <w:rFonts w:asciiTheme="minorHAnsi" w:hAnsiTheme="minorHAnsi" w:cstheme="minorHAnsi"/>
-                <w:b/>
-                <w:i/>
+                <w:color w:val="000000" w:themeColor="text1"/>
+                <w:sz w:val="20"/>
+                <w:szCs w:val="20"/>
+              </w:rPr>
+              <w:t xml:space="preserve">water depth measurements </w:t>
+            </w:r>
+            <w:r>
+              <w:rPr>
+                <w:rFonts w:asciiTheme="minorHAnsi" w:hAnsiTheme="minorHAnsi" w:cstheme="minorHAnsi"/>
                 <w:iCs/>
-                <w:sz w:val="20"/>
-                <w:szCs w:val="20"/>
-              </w:rPr>
-              <w:t>.csv</w:t>
-            </w:r>
-          </w:p>
-        </w:tc>
-        <w:tc>
-          <w:tcPr>
-            <w:tcW w:w="6740" w:type="dxa"/>
-            <w:vAlign w:val="center"/>
-          </w:tcPr>
+                <w:color w:val="000000" w:themeColor="text1"/>
+                <w:sz w:val="20"/>
+                <w:szCs w:val="20"/>
+              </w:rPr>
+              <w:t>below floating chambers during flux measurement, found using measuring sticks.</w:t>
+            </w:r>
+          </w:p>
           <w:p>
             <w:pPr>
               <w:pStyle w:val="NormalWeb"/>
@@ -4785,7 +4643,7 @@
                 <w:sz w:val="20"/>
                 <w:szCs w:val="20"/>
               </w:rPr>
-              <w:t>Depth</w:t>
+              <w:t>Dissolved CH4:</w:t>
             </w:r>
             <w:r>
               <w:rPr>
@@ -4795,7 +4653,7 @@
                 <w:sz w:val="20"/>
                 <w:szCs w:val="20"/>
               </w:rPr>
-              <w:t xml:space="preserve">: </w:t>
+              <w:t xml:space="preserve"> </w:t>
             </w:r>
             <w:r>
               <w:rPr>
@@ -4805,7 +4663,7 @@
                 <w:sz w:val="20"/>
                 <w:szCs w:val="20"/>
               </w:rPr>
-              <w:t xml:space="preserve">water depth measurements </w:t>
+              <w:t xml:space="preserve">dissolved methane concentrations were </w:t>
             </w:r>
             <w:r>
               <w:rPr>
@@ -4815,7 +4673,128 @@
                 <w:sz w:val="20"/>
                 <w:szCs w:val="20"/>
               </w:rPr>
-              <w:t>below floating chambers during flux measurement, found using measuring sticks.</w:t>
+              <w:t xml:space="preserve">calculated using the neonDissGas R package which takes in </w:t>
+            </w:r>
+            <w:r>
+              <w:rPr>
+                <w:rFonts w:asciiTheme="minorHAnsi" w:hAnsiTheme="minorHAnsi" w:cstheme="minorHAnsi"/>
+                <w:iCs/>
+                <w:color w:val="000000" w:themeColor="text1"/>
+                <w:sz w:val="20"/>
+                <w:szCs w:val="20"/>
+              </w:rPr>
+              <w:t xml:space="preserve">the </w:t>
+            </w:r>
+            <w:r>
+              <w:rPr>
+                <w:rFonts w:asciiTheme="minorHAnsi" w:hAnsiTheme="minorHAnsi" w:cstheme="minorHAnsi"/>
+                <w:iCs/>
+                <w:color w:val="000000" w:themeColor="text1"/>
+                <w:sz w:val="20"/>
+                <w:szCs w:val="20"/>
+              </w:rPr>
+              <w:t>equilibration ratio</w:t>
+            </w:r>
+            <w:r>
+              <w:rPr>
+                <w:rFonts w:asciiTheme="minorHAnsi" w:hAnsiTheme="minorHAnsi" w:cstheme="minorHAnsi"/>
+                <w:iCs/>
+                <w:color w:val="000000" w:themeColor="text1"/>
+                <w:sz w:val="20"/>
+                <w:szCs w:val="20"/>
+              </w:rPr>
+              <w:t xml:space="preserve"> </w:t>
+            </w:r>
+            <w:r>
+              <w:rPr>
+                <w:rFonts w:asciiTheme="minorHAnsi" w:hAnsiTheme="minorHAnsi" w:cstheme="minorHAnsi"/>
+                <w:iCs/>
+                <w:color w:val="000000" w:themeColor="text1"/>
+                <w:sz w:val="20"/>
+                <w:szCs w:val="20"/>
+              </w:rPr>
+              <w:t>of volume of water to</w:t>
+            </w:r>
+            <w:r>
+              <w:rPr>
+                <w:rFonts w:asciiTheme="minorHAnsi" w:hAnsiTheme="minorHAnsi" w:cstheme="minorHAnsi"/>
+                <w:iCs/>
+                <w:color w:val="000000" w:themeColor="text1"/>
+                <w:sz w:val="20"/>
+                <w:szCs w:val="20"/>
+              </w:rPr>
+              <w:t xml:space="preserve"> gas </w:t>
+            </w:r>
+            <w:r>
+              <w:rPr>
+                <w:rFonts w:asciiTheme="minorHAnsi" w:hAnsiTheme="minorHAnsi" w:cstheme="minorHAnsi"/>
+                <w:iCs/>
+                <w:color w:val="000000" w:themeColor="text1"/>
+                <w:sz w:val="20"/>
+                <w:szCs w:val="20"/>
+              </w:rPr>
+              <w:t>in the 10mL syringe (5:5)</w:t>
+            </w:r>
+            <w:r>
+              <w:rPr>
+                <w:rFonts w:asciiTheme="minorHAnsi" w:hAnsiTheme="minorHAnsi" w:cstheme="minorHAnsi"/>
+                <w:iCs/>
+                <w:color w:val="000000" w:themeColor="text1"/>
+                <w:sz w:val="20"/>
+                <w:szCs w:val="20"/>
+              </w:rPr>
+              <w:t xml:space="preserve"> from the field</w:t>
+            </w:r>
+            <w:r>
+              <w:rPr>
+                <w:rFonts w:asciiTheme="minorHAnsi" w:hAnsiTheme="minorHAnsi" w:cstheme="minorHAnsi"/>
+                <w:iCs/>
+                <w:color w:val="000000" w:themeColor="text1"/>
+                <w:sz w:val="20"/>
+                <w:szCs w:val="20"/>
+              </w:rPr>
+              <w:t xml:space="preserve">, </w:t>
+            </w:r>
+            <w:r>
+              <w:rPr>
+                <w:rFonts w:asciiTheme="minorHAnsi" w:hAnsiTheme="minorHAnsi" w:cstheme="minorHAnsi"/>
+                <w:iCs/>
+                <w:color w:val="000000" w:themeColor="text1"/>
+                <w:sz w:val="20"/>
+                <w:szCs w:val="20"/>
+              </w:rPr>
+              <w:t>CH</w:t>
+            </w:r>
+            <w:r>
+              <w:rPr>
+                <w:rFonts w:asciiTheme="minorHAnsi" w:hAnsiTheme="minorHAnsi" w:cstheme="minorHAnsi"/>
+                <w:iCs/>
+                <w:color w:val="000000" w:themeColor="text1"/>
+                <w:sz w:val="20"/>
+                <w:szCs w:val="20"/>
+                <w:vertAlign w:val="subscript"/>
+              </w:rPr>
+              <w:t>4</w:t>
+            </w:r>
+            <w:r>
+              <w:rPr>
+                <w:rFonts w:asciiTheme="minorHAnsi" w:hAnsiTheme="minorHAnsi" w:cstheme="minorHAnsi"/>
+                <w:iCs/>
+                <w:color w:val="000000" w:themeColor="text1"/>
+                <w:sz w:val="20"/>
+                <w:szCs w:val="20"/>
+              </w:rPr>
+              <w:t xml:space="preserve"> mixing ratio (in ppm) found from the LICOR, and </w:t>
+            </w:r>
+            <w:r>
+              <w:rPr>
+                <w:rFonts w:asciiTheme="minorHAnsi" w:hAnsiTheme="minorHAnsi" w:cstheme="minorHAnsi"/>
+                <w:iCs/>
+                <w:color w:val="000000" w:themeColor="text1"/>
+                <w:sz w:val="20"/>
+                <w:szCs w:val="20"/>
+              </w:rPr>
+              <w:t xml:space="preserve">water temperatures at the time of measurement. </w:t>
             </w:r>
           </w:p>
           <w:p>
@@ -4842,7 +4821,7 @@
                 <w:sz w:val="20"/>
                 <w:szCs w:val="20"/>
               </w:rPr>
-              <w:t>Dissolved CH4:</w:t>
+              <w:t>pH:</w:t>
             </w:r>
             <w:r>
               <w:rPr>
@@ -4862,7 +4841,7 @@
                 <w:sz w:val="20"/>
                 <w:szCs w:val="20"/>
               </w:rPr>
-              <w:t xml:space="preserve">dissolved methane concentrations were </w:t>
+              <w:t>measured in the field using a HANNA HI-98195, before every floating chamber’s open and vegetated measurement</w:t>
             </w:r>
             <w:r>
               <w:rPr>
@@ -4872,7 +4851,7 @@
                 <w:sz w:val="20"/>
                 <w:szCs w:val="20"/>
               </w:rPr>
-              <w:t xml:space="preserve">calculated using the neonDissGas R package which takes in </w:t>
+              <w:t xml:space="preserve"> within the top 10cm of surface waters</w:t>
             </w:r>
             <w:r>
               <w:rPr>
@@ -4882,118 +4861,7 @@
                 <w:sz w:val="20"/>
                 <w:szCs w:val="20"/>
               </w:rPr>
-              <w:t xml:space="preserve">the </w:t>
-            </w:r>
-            <w:r>
-              <w:rPr>
-                <w:rFonts w:asciiTheme="minorHAnsi" w:hAnsiTheme="minorHAnsi" w:cstheme="minorHAnsi"/>
-                <w:iCs/>
-                <w:color w:val="000000" w:themeColor="text1"/>
-                <w:sz w:val="20"/>
-                <w:szCs w:val="20"/>
-              </w:rPr>
-              <w:t>equilibration ratio</w:t>
-            </w:r>
-            <w:r>
-              <w:rPr>
-                <w:rFonts w:asciiTheme="minorHAnsi" w:hAnsiTheme="minorHAnsi" w:cstheme="minorHAnsi"/>
-                <w:iCs/>
-                <w:color w:val="000000" w:themeColor="text1"/>
-                <w:sz w:val="20"/>
-                <w:szCs w:val="20"/>
-              </w:rPr>
-              <w:t xml:space="preserve"> </w:t>
-            </w:r>
-            <w:r>
-              <w:rPr>
-                <w:rFonts w:asciiTheme="minorHAnsi" w:hAnsiTheme="minorHAnsi" w:cstheme="minorHAnsi"/>
-                <w:iCs/>
-                <w:color w:val="000000" w:themeColor="text1"/>
-                <w:sz w:val="20"/>
-                <w:szCs w:val="20"/>
-              </w:rPr>
-              <w:t>of volume of water to</w:t>
-            </w:r>
-            <w:r>
-              <w:rPr>
-                <w:rFonts w:asciiTheme="minorHAnsi" w:hAnsiTheme="minorHAnsi" w:cstheme="minorHAnsi"/>
-                <w:iCs/>
-                <w:color w:val="000000" w:themeColor="text1"/>
-                <w:sz w:val="20"/>
-                <w:szCs w:val="20"/>
-              </w:rPr>
-              <w:t xml:space="preserve"> gas </w:t>
-            </w:r>
-            <w:r>
-              <w:rPr>
-                <w:rFonts w:asciiTheme="minorHAnsi" w:hAnsiTheme="minorHAnsi" w:cstheme="minorHAnsi"/>
-                <w:iCs/>
-                <w:color w:val="000000" w:themeColor="text1"/>
-                <w:sz w:val="20"/>
-                <w:szCs w:val="20"/>
-              </w:rPr>
-              <w:t>in the 10mL syringe (5:5)</w:t>
-            </w:r>
-            <w:r>
-              <w:rPr>
-                <w:rFonts w:asciiTheme="minorHAnsi" w:hAnsiTheme="minorHAnsi" w:cstheme="minorHAnsi"/>
-                <w:iCs/>
-                <w:color w:val="000000" w:themeColor="text1"/>
-                <w:sz w:val="20"/>
-                <w:szCs w:val="20"/>
-              </w:rPr>
-              <w:t xml:space="preserve"> from the field</w:t>
-            </w:r>
-            <w:r>
-              <w:rPr>
-                <w:rFonts w:asciiTheme="minorHAnsi" w:hAnsiTheme="minorHAnsi" w:cstheme="minorHAnsi"/>
-                <w:iCs/>
-                <w:color w:val="000000" w:themeColor="text1"/>
-                <w:sz w:val="20"/>
-                <w:szCs w:val="20"/>
-              </w:rPr>
-              <w:t xml:space="preserve">, </w:t>
-            </w:r>
-            <w:r>
-              <w:rPr>
-                <w:rFonts w:asciiTheme="minorHAnsi" w:hAnsiTheme="minorHAnsi" w:cstheme="minorHAnsi"/>
-                <w:iCs/>
-                <w:color w:val="000000" w:themeColor="text1"/>
-                <w:sz w:val="20"/>
-                <w:szCs w:val="20"/>
-              </w:rPr>
-              <w:t>CH</w:t>
-            </w:r>
-            <w:r>
-              <w:rPr>
-                <w:rFonts w:asciiTheme="minorHAnsi" w:hAnsiTheme="minorHAnsi" w:cstheme="minorHAnsi"/>
-                <w:iCs/>
-                <w:color w:val="000000" w:themeColor="text1"/>
-                <w:sz w:val="20"/>
-                <w:szCs w:val="20"/>
-                <w:vertAlign w:val="subscript"/>
-              </w:rPr>
-              <w:t>4</w:t>
-            </w:r>
-            <w:r>
-              <w:rPr>
-                <w:rFonts w:asciiTheme="minorHAnsi" w:hAnsiTheme="minorHAnsi" w:cstheme="minorHAnsi"/>
-                <w:iCs/>
-                <w:color w:val="000000" w:themeColor="text1"/>
-                <w:sz w:val="20"/>
-                <w:szCs w:val="20"/>
-              </w:rPr>
-              <w:t xml:space="preserve"> mixing ratio (in ppm) found from the LICOR, and </w:t>
-            </w:r>
-            <w:r>
-              <w:rPr>
-                <w:rFonts w:asciiTheme="minorHAnsi" w:hAnsiTheme="minorHAnsi" w:cstheme="minorHAnsi"/>
-                <w:iCs/>
-                <w:color w:val="000000" w:themeColor="text1"/>
-                <w:sz w:val="20"/>
-                <w:szCs w:val="20"/>
-              </w:rPr>
-              <w:t xml:space="preserve">water temperatures at the time of measurement. </w:t>
+              <w:t xml:space="preserve">. </w:t>
             </w:r>
           </w:p>
           <w:p>
@@ -5020,7 +4888,7 @@
                 <w:sz w:val="20"/>
                 <w:szCs w:val="20"/>
               </w:rPr>
-              <w:t>pH:</w:t>
+              <w:t xml:space="preserve">Conductivity: </w:t>
             </w:r>
             <w:r>
               <w:rPr>
@@ -5030,37 +4898,7 @@
                 <w:sz w:val="20"/>
                 <w:szCs w:val="20"/>
               </w:rPr>
-              <w:t xml:space="preserve"> </w:t>
-            </w:r>
-            <w:r>
-              <w:rPr>
-                <w:rFonts w:asciiTheme="minorHAnsi" w:hAnsiTheme="minorHAnsi" w:cstheme="minorHAnsi"/>
-                <w:iCs/>
-                <w:color w:val="000000" w:themeColor="text1"/>
-                <w:sz w:val="20"/>
-                <w:szCs w:val="20"/>
-              </w:rPr>
-              <w:t>measured in the field using a HANNA HI-98195, before every floating chamber’s open and vegetated measurement</w:t>
-            </w:r>
-            <w:r>
-              <w:rPr>
-                <w:rFonts w:asciiTheme="minorHAnsi" w:hAnsiTheme="minorHAnsi" w:cstheme="minorHAnsi"/>
-                <w:iCs/>
-                <w:color w:val="000000" w:themeColor="text1"/>
-                <w:sz w:val="20"/>
-                <w:szCs w:val="20"/>
-              </w:rPr>
-              <w:t xml:space="preserve"> within the top 10cm of surface waters</w:t>
-            </w:r>
-            <w:r>
-              <w:rPr>
-                <w:rFonts w:asciiTheme="minorHAnsi" w:hAnsiTheme="minorHAnsi" w:cstheme="minorHAnsi"/>
-                <w:iCs/>
-                <w:color w:val="000000" w:themeColor="text1"/>
-                <w:sz w:val="20"/>
-                <w:szCs w:val="20"/>
-              </w:rPr>
-              <w:t xml:space="preserve">. </w:t>
+              <w:t>measured in the field using a HANNA HI-98195, before every floating chamber’s open and vegetated measurement within the top 10cm of surface waters.</w:t>
             </w:r>
           </w:p>
           <w:p>
@@ -5087,7 +4925,7 @@
                 <w:sz w:val="20"/>
                 <w:szCs w:val="20"/>
               </w:rPr>
-              <w:t xml:space="preserve">Conductivity: </w:t>
+              <w:t xml:space="preserve">Total Dissolved Solids: </w:t>
             </w:r>
             <w:r>
               <w:rPr>
@@ -5097,7 +4935,7 @@
                 <w:sz w:val="20"/>
                 <w:szCs w:val="20"/>
               </w:rPr>
-              <w:t>measured in the field using a HANNA HI-98195, before every floating chamber’s open and vegetated measurement within the top 10cm of surface waters.</w:t>
+              <w:t xml:space="preserve">measured in the field using a HANNA HI-98195, before every floating chamber’s open and vegetated measurement within the top 10cm of surface waters. </w:t>
             </w:r>
           </w:p>
           <w:p>
@@ -5124,7 +4962,7 @@
                 <w:sz w:val="20"/>
                 <w:szCs w:val="20"/>
               </w:rPr>
-              <w:t xml:space="preserve">Total Dissolved Solids: </w:t>
+              <w:t xml:space="preserve">HP Water Temperature: </w:t>
             </w:r>
             <w:r>
               <w:rPr>
@@ -5134,7 +4972,7 @@
                 <w:sz w:val="20"/>
                 <w:szCs w:val="20"/>
               </w:rPr>
-              <w:t xml:space="preserve">measured in the field using a HANNA HI-98195, before every floating chamber’s open and vegetated measurement within the top 10cm of surface waters. </w:t>
+              <w:t>measured in the field using a HANNA HI-98195, before every floating chamber’s open and vegetated measurement within the top 10cm of surface waters.</w:t>
             </w:r>
           </w:p>
           <w:p>
@@ -5161,18 +4999,7 @@
                 <w:sz w:val="20"/>
                 <w:szCs w:val="20"/>
               </w:rPr>
-              <w:lastRenderedPageBreak/>
-              <w:t xml:space="preserve">HP Water Temperature: </w:t>
-            </w:r>
-            <w:r>
-              <w:rPr>
-                <w:rFonts w:asciiTheme="minorHAnsi" w:hAnsiTheme="minorHAnsi" w:cstheme="minorHAnsi"/>
-                <w:iCs/>
-                <w:color w:val="000000" w:themeColor="text1"/>
-                <w:sz w:val="20"/>
-                <w:szCs w:val="20"/>
-              </w:rPr>
-              <w:t>measured in the field using a HANNA HI-98195, before every floating chamber’s open and vegetated measurement within the top 10cm of surface waters.</w:t>
+              <w:t>Hydrostatic Pressure: measured in the field using a HANNA HI-98195, before every floating chamber’s open and vegetated measurement within the top 10cm of surface waters.</w:t>
             </w:r>
           </w:p>
           <w:p>
@@ -5199,7 +5026,7 @@
                 <w:sz w:val="20"/>
                 <w:szCs w:val="20"/>
               </w:rPr>
-              <w:t>Hydrostatic Pressure: measured in the field using a HANNA HI-98195, before every floating chamber’s open and vegetated measurement within the top 10cm of surface waters.</w:t>
+              <w:t>DO: measured in the field using a YSI 550A DO meter, before every floating chamber’s open and vegetated measurement within the top 10cm of surface waters.</w:t>
             </w:r>
           </w:p>
           <w:p>
@@ -5226,7 +5053,38 @@
                 <w:sz w:val="20"/>
                 <w:szCs w:val="20"/>
               </w:rPr>
-              <w:t>DO: measured in the field using a YSI 550A DO meter, before every floating chamber’s open and vegetated measurement within the top 10cm of surface waters.</w:t>
+              <w:lastRenderedPageBreak/>
+              <w:t xml:space="preserve">Bottom Water Light Availability: light intensity as measured by </w:t>
+            </w:r>
+            <w:r>
+              <w:rPr>
+                <w:rFonts w:asciiTheme="minorHAnsi" w:hAnsiTheme="minorHAnsi" w:cstheme="minorHAnsi"/>
+                <w:iCs/>
+                <w:color w:val="000000" w:themeColor="text1"/>
+                <w:sz w:val="20"/>
+                <w:szCs w:val="20"/>
+              </w:rPr>
+              <w:t xml:space="preserve">Onset HOBO UA-002-64 </w:t>
+            </w:r>
+            <w:r>
+              <w:rPr>
+                <w:rFonts w:asciiTheme="minorHAnsi" w:hAnsiTheme="minorHAnsi" w:cstheme="minorHAnsi"/>
+                <w:iCs/>
+                <w:color w:val="000000" w:themeColor="text1"/>
+                <w:sz w:val="20"/>
+                <w:szCs w:val="20"/>
+              </w:rPr>
+              <w:t xml:space="preserve">pendent logger from the bottom waters, which was 5cm above </w:t>
+            </w:r>
+            <w:r>
+              <w:rPr>
+                <w:rFonts w:asciiTheme="minorHAnsi" w:hAnsiTheme="minorHAnsi" w:cstheme="minorHAnsi"/>
+                <w:iCs/>
+                <w:color w:val="000000" w:themeColor="text1"/>
+                <w:sz w:val="20"/>
+                <w:szCs w:val="20"/>
+              </w:rPr>
+              <w:t>the anchor for one open and vegetated bubble trap in each respective zone.</w:t>
             </w:r>
           </w:p>
           <w:p>
@@ -5253,7 +5111,7 @@
                 <w:sz w:val="20"/>
                 <w:szCs w:val="20"/>
               </w:rPr>
-              <w:t xml:space="preserve">Bottom Water Light Availability: light intensity as measured by </w:t>
+              <w:t xml:space="preserve">Surface Water Light Availability: light intensity as measured by Onset HOBO UA-002-64 pendent logger from the </w:t>
             </w:r>
             <w:r>
               <w:rPr>
@@ -5263,7 +5121,7 @@
                 <w:sz w:val="20"/>
                 <w:szCs w:val="20"/>
               </w:rPr>
-              <w:t xml:space="preserve">Onset HOBO UA-002-64 </w:t>
+              <w:t>surface</w:t>
             </w:r>
             <w:r>
               <w:rPr>
@@ -5273,7 +5131,7 @@
                 <w:sz w:val="20"/>
                 <w:szCs w:val="20"/>
               </w:rPr>
-              <w:t xml:space="preserve">pendent logger from the bottom waters, which was 5cm above </w:t>
+              <w:t xml:space="preserve"> waters, which was </w:t>
             </w:r>
             <w:r>
               <w:rPr>
@@ -5283,7 +5141,37 @@
                 <w:sz w:val="20"/>
                 <w:szCs w:val="20"/>
               </w:rPr>
-              <w:t>the anchor for one open and vegetated bubble trap in each respective zone.</w:t>
+              <w:t>within 5cm</w:t>
+            </w:r>
+            <w:r>
+              <w:rPr>
+                <w:rFonts w:asciiTheme="minorHAnsi" w:hAnsiTheme="minorHAnsi" w:cstheme="minorHAnsi"/>
+                <w:iCs/>
+                <w:color w:val="000000" w:themeColor="text1"/>
+                <w:sz w:val="20"/>
+                <w:szCs w:val="20"/>
+              </w:rPr>
+              <w:t xml:space="preserve"> </w:t>
+            </w:r>
+            <w:r>
+              <w:rPr>
+                <w:rFonts w:asciiTheme="minorHAnsi" w:hAnsiTheme="minorHAnsi" w:cstheme="minorHAnsi"/>
+                <w:iCs/>
+                <w:color w:val="000000" w:themeColor="text1"/>
+                <w:sz w:val="20"/>
+                <w:szCs w:val="20"/>
+              </w:rPr>
+              <w:t>of the surface water</w:t>
+            </w:r>
+            <w:r>
+              <w:rPr>
+                <w:rFonts w:asciiTheme="minorHAnsi" w:hAnsiTheme="minorHAnsi" w:cstheme="minorHAnsi"/>
+                <w:iCs/>
+                <w:color w:val="000000" w:themeColor="text1"/>
+                <w:sz w:val="20"/>
+                <w:szCs w:val="20"/>
+              </w:rPr>
+              <w:t xml:space="preserve"> for one open and vegetated bubble trap in each respective zone.</w:t>
             </w:r>
           </w:p>
           <w:p>
@@ -5310,7 +5198,7 @@
                 <w:sz w:val="20"/>
                 <w:szCs w:val="20"/>
               </w:rPr>
-              <w:t xml:space="preserve">Surface Water Light Availability: light intensity as measured by Onset HOBO UA-002-64 pendent logger from the </w:t>
+              <w:t>HOBO Daily</w:t>
             </w:r>
             <w:r>
               <w:rPr>
@@ -5320,7 +5208,7 @@
                 <w:sz w:val="20"/>
                 <w:szCs w:val="20"/>
               </w:rPr>
-              <w:t>surface</w:t>
+              <w:t>/3-Day/7-Day</w:t>
             </w:r>
             <w:r>
               <w:rPr>
@@ -5330,7 +5218,7 @@
                 <w:sz w:val="20"/>
                 <w:szCs w:val="20"/>
               </w:rPr>
-              <w:t xml:space="preserve"> waters, which was </w:t>
+              <w:t xml:space="preserve"> Air Temperature</w:t>
             </w:r>
             <w:r>
               <w:rPr>
@@ -5340,7 +5228,7 @@
                 <w:sz w:val="20"/>
                 <w:szCs w:val="20"/>
               </w:rPr>
-              <w:t>within 5cm</w:t>
+              <w:t xml:space="preserve">: measured in the field using Onset HOBO UA-001-64 pendent loggers attached to </w:t>
             </w:r>
             <w:r>
               <w:rPr>
@@ -5350,7 +5238,7 @@
                 <w:sz w:val="20"/>
                 <w:szCs w:val="20"/>
               </w:rPr>
-              <w:t xml:space="preserve"> </w:t>
+              <w:t>the top of one open and one vegetated bubble trap that sat above the water surface. Loggers captured data every 2 hours, but measurements were averaged across the entire day</w:t>
             </w:r>
             <w:r>
               <w:rPr>
@@ -5360,7 +5248,7 @@
                 <w:sz w:val="20"/>
                 <w:szCs w:val="20"/>
               </w:rPr>
-              <w:t>of the surface water</w:t>
+              <w:t xml:space="preserve"> or 3- and 7-day moving averages</w:t>
             </w:r>
             <w:r>
               <w:rPr>
@@ -5370,7 +5258,7 @@
                 <w:sz w:val="20"/>
                 <w:szCs w:val="20"/>
               </w:rPr>
-              <w:t xml:space="preserve"> for one open and vegetated bubble trap in each respective zone.</w:t>
+              <w:t>.</w:t>
             </w:r>
           </w:p>
           <w:p>
@@ -5397,7 +5285,7 @@
                 <w:sz w:val="20"/>
                 <w:szCs w:val="20"/>
               </w:rPr>
-              <w:t>HOBO Daily</w:t>
+              <w:t xml:space="preserve">HOBO </w:t>
             </w:r>
             <w:r>
               <w:rPr>
@@ -5407,7 +5295,7 @@
                 <w:sz w:val="20"/>
                 <w:szCs w:val="20"/>
               </w:rPr>
-              <w:t>/3-Day/7-Day</w:t>
+              <w:t xml:space="preserve">Daily/3-Day/7-Day </w:t>
             </w:r>
             <w:r>
               <w:rPr>
@@ -5417,7 +5305,7 @@
                 <w:sz w:val="20"/>
                 <w:szCs w:val="20"/>
               </w:rPr>
-              <w:t xml:space="preserve"> Air Temperature</w:t>
+              <w:t xml:space="preserve">Bottom Water Temperature: measured in the field using Onset HOBO UA-001-64/UA-002064 pendent loggers attached 5cm’s above the anchor for one open and one vegetated bubble trap. Loggers captured data every 2 hours, but measurements were averaged across the </w:t>
             </w:r>
             <w:r>
               <w:rPr>
@@ -5427,27 +5315,7 @@
                 <w:sz w:val="20"/>
                 <w:szCs w:val="20"/>
               </w:rPr>
-              <w:t xml:space="preserve">: measured in the field using Onset HOBO UA-001-64 pendent loggers attached to </w:t>
-            </w:r>
-            <w:r>
-              <w:rPr>
-                <w:rFonts w:asciiTheme="minorHAnsi" w:hAnsiTheme="minorHAnsi" w:cstheme="minorHAnsi"/>
-                <w:iCs/>
-                <w:color w:val="000000" w:themeColor="text1"/>
-                <w:sz w:val="20"/>
-                <w:szCs w:val="20"/>
-              </w:rPr>
-              <w:t>the top of one open and one vegetated bubble trap that sat above the water surface. Loggers captured data every 2 hours, but measurements were averaged across the entire day</w:t>
-            </w:r>
-            <w:r>
-              <w:rPr>
-                <w:rFonts w:asciiTheme="minorHAnsi" w:hAnsiTheme="minorHAnsi" w:cstheme="minorHAnsi"/>
-                <w:iCs/>
-                <w:color w:val="000000" w:themeColor="text1"/>
-                <w:sz w:val="20"/>
-                <w:szCs w:val="20"/>
-              </w:rPr>
-              <w:t xml:space="preserve"> or 3- and 7-day moving averages</w:t>
+              <w:t>entire day or 3- and 7-day moving averages</w:t>
             </w:r>
             <w:r>
               <w:rPr>
@@ -5504,7 +5372,7 @@
                 <w:sz w:val="20"/>
                 <w:szCs w:val="20"/>
               </w:rPr>
-              <w:t xml:space="preserve">Bottom Water Temperature: measured in the field using Onset HOBO UA-001-64/UA-002064 pendent loggers attached 5cm’s above the anchor for one open and one vegetated bubble trap. Loggers captured data every 2 hours, but measurements were averaged across the </w:t>
+              <w:t xml:space="preserve">Surface Water Temperature: measured in the field using Onset HOBO UA-001-64/UA-002-064 pendent loggers attached within 5cm’s of the surface water for one open and one vegetated bubble trap. Loggers captured data every 2 hours, but measurements were averaged across the </w:t>
             </w:r>
             <w:r>
               <w:rPr>
@@ -5571,7 +5439,7 @@
                 <w:sz w:val="20"/>
                 <w:szCs w:val="20"/>
               </w:rPr>
-              <w:t xml:space="preserve">Surface Water Temperature: measured in the field using Onset HOBO UA-001-64/UA-002-064 pendent loggers attached within 5cm’s of the surface water for one open and one vegetated bubble trap. Loggers captured data every 2 hours, but measurements were averaged across the </w:t>
+              <w:t xml:space="preserve">Sediment Temperature: measured in the field using Onset HOBO UA-001-64 pendent loggers attached to the </w:t>
             </w:r>
             <w:r>
               <w:rPr>
@@ -5581,7 +5449,7 @@
                 <w:sz w:val="20"/>
                 <w:szCs w:val="20"/>
               </w:rPr>
-              <w:t>entire day or 3- and 7-day moving averages</w:t>
+              <w:t xml:space="preserve">bottom of the </w:t>
             </w:r>
             <w:r>
               <w:rPr>
@@ -5591,9 +5459,135 @@
                 <w:sz w:val="20"/>
                 <w:szCs w:val="20"/>
               </w:rPr>
+              <w:t xml:space="preserve">anchor for one open and one vegetated bubble trap. Loggers captured data every 2 hours, but measurements were averaged across the </w:t>
+            </w:r>
+            <w:r>
+              <w:rPr>
+                <w:rFonts w:asciiTheme="minorHAnsi" w:hAnsiTheme="minorHAnsi" w:cstheme="minorHAnsi"/>
+                <w:iCs/>
+                <w:color w:val="000000" w:themeColor="text1"/>
+                <w:sz w:val="20"/>
+                <w:szCs w:val="20"/>
+              </w:rPr>
+              <w:t>entire day or 3- and 7-day moving averages</w:t>
+            </w:r>
+            <w:r>
+              <w:rPr>
+                <w:rFonts w:asciiTheme="minorHAnsi" w:hAnsiTheme="minorHAnsi" w:cstheme="minorHAnsi"/>
+                <w:iCs/>
+                <w:color w:val="000000" w:themeColor="text1"/>
+                <w:sz w:val="20"/>
+                <w:szCs w:val="20"/>
+              </w:rPr>
               <w:t>.</w:t>
             </w:r>
           </w:p>
+        </w:tc>
+      </w:tr>
+      <w:tr>
+        <w:trPr>
+          <w:jc w:val="center"/>
+        </w:trPr>
+        <w:tc>
+          <w:tcPr>
+            <w:tcW w:w="3268" w:type="dxa"/>
+            <w:vAlign w:val="center"/>
+          </w:tcPr>
+          <w:p>
+            <w:pPr>
+              <w:pStyle w:val="NormalWeb"/>
+              <w:contextualSpacing/>
+              <w:rPr>
+                <w:rFonts w:asciiTheme="minorHAnsi" w:hAnsiTheme="minorHAnsi" w:cstheme="minorHAnsi"/>
+                <w:b/>
+                <w:sz w:val="20"/>
+                <w:szCs w:val="20"/>
+              </w:rPr>
+            </w:pPr>
+            <w:r>
+              <w:rPr>
+                <w:rFonts w:asciiTheme="minorHAnsi" w:hAnsiTheme="minorHAnsi" w:cstheme="minorHAnsi"/>
+                <w:b/>
+                <w:sz w:val="20"/>
+                <w:szCs w:val="20"/>
+              </w:rPr>
+              <w:lastRenderedPageBreak/>
+              <w:t>Laboratory, field, or other analytical methods –</w:t>
+            </w:r>
+          </w:p>
+          <w:p>
+            <w:pPr>
+              <w:pStyle w:val="NormalWeb"/>
+              <w:contextualSpacing/>
+              <w:rPr>
+                <w:rFonts w:asciiTheme="minorHAnsi" w:hAnsiTheme="minorHAnsi" w:cstheme="minorHAnsi"/>
+                <w:b/>
+                <w:sz w:val="20"/>
+                <w:szCs w:val="20"/>
+              </w:rPr>
+            </w:pPr>
+            <w:r>
+              <w:rPr>
+                <w:rFonts w:asciiTheme="minorHAnsi" w:hAnsiTheme="minorHAnsi" w:cstheme="minorHAnsi"/>
+                <w:b/>
+                <w:i/>
+                <w:iCs/>
+                <w:sz w:val="20"/>
+                <w:szCs w:val="20"/>
+              </w:rPr>
+              <w:t>Data</w:t>
+            </w:r>
+            <w:r>
+              <w:rPr>
+                <w:rFonts w:asciiTheme="minorHAnsi" w:hAnsiTheme="minorHAnsi" w:cstheme="minorHAnsi"/>
+                <w:b/>
+                <w:i/>
+                <w:iCs/>
+                <w:sz w:val="20"/>
+                <w:szCs w:val="20"/>
+              </w:rPr>
+              <w:t>5</w:t>
+            </w:r>
+            <w:r>
+              <w:rPr>
+                <w:rFonts w:asciiTheme="minorHAnsi" w:hAnsiTheme="minorHAnsi" w:cstheme="minorHAnsi"/>
+                <w:b/>
+                <w:i/>
+                <w:iCs/>
+                <w:sz w:val="20"/>
+                <w:szCs w:val="20"/>
+              </w:rPr>
+              <w:t>_</w:t>
+            </w:r>
+            <w:r>
+              <w:rPr>
+                <w:rFonts w:asciiTheme="minorHAnsi" w:hAnsiTheme="minorHAnsi" w:cstheme="minorHAnsi"/>
+                <w:b/>
+                <w:i/>
+                <w:iCs/>
+                <w:sz w:val="20"/>
+                <w:szCs w:val="20"/>
+              </w:rPr>
+              <w:t>CH4Isotopes</w:t>
+            </w:r>
+            <w:r>
+              <w:rPr>
+                <w:rFonts w:asciiTheme="minorHAnsi" w:hAnsiTheme="minorHAnsi" w:cstheme="minorHAnsi"/>
+                <w:b/>
+                <w:i/>
+                <w:iCs/>
+                <w:sz w:val="20"/>
+                <w:szCs w:val="20"/>
+              </w:rPr>
+              <w:t>.csv</w:t>
+            </w:r>
+          </w:p>
+        </w:tc>
+        <w:tc>
+          <w:tcPr>
+            <w:tcW w:w="6740" w:type="dxa"/>
+            <w:vAlign w:val="center"/>
+          </w:tcPr>
           <w:p>
             <w:pPr>
               <w:pStyle w:val="NormalWeb"/>
@@ -5618,7 +5612,7 @@
                 <w:sz w:val="20"/>
                 <w:szCs w:val="20"/>
               </w:rPr>
-              <w:t xml:space="preserve">HOBO </w:t>
+              <w:t xml:space="preserve">d13C-CH4: </w:t>
             </w:r>
             <w:r>
               <w:rPr>
@@ -5628,7 +5622,7 @@
                 <w:sz w:val="20"/>
                 <w:szCs w:val="20"/>
               </w:rPr>
-              <w:t xml:space="preserve">Daily/3-Day/7-Day </w:t>
+              <w:t xml:space="preserve">stable carbon </w:t>
             </w:r>
             <w:r>
               <w:rPr>
@@ -5638,7 +5632,7 @@
                 <w:sz w:val="20"/>
                 <w:szCs w:val="20"/>
               </w:rPr>
-              <w:t xml:space="preserve">Sediment Temperature: measured in the field using Onset HOBO UA-001-64 pendent loggers attached to the </w:t>
+              <w:t xml:space="preserve">isotopic composition </w:t>
             </w:r>
             <w:r>
               <w:rPr>
@@ -5648,7 +5642,7 @@
                 <w:sz w:val="20"/>
                 <w:szCs w:val="20"/>
               </w:rPr>
-              <w:t xml:space="preserve">bottom of the </w:t>
+              <w:t>of CH</w:t>
             </w:r>
             <w:r>
               <w:rPr>
@@ -5657,8 +5651,9 @@
                 <w:color w:val="000000" w:themeColor="text1"/>
                 <w:sz w:val="20"/>
                 <w:szCs w:val="20"/>
-              </w:rPr>
-              <w:t xml:space="preserve">anchor for one open and one vegetated bubble trap. Loggers captured data every 2 hours, but measurements were averaged across the </w:t>
+                <w:vertAlign w:val="subscript"/>
+              </w:rPr>
+              <w:t>4</w:t>
             </w:r>
             <w:r>
               <w:rPr>
@@ -5668,7 +5663,7 @@
                 <w:sz w:val="20"/>
                 <w:szCs w:val="20"/>
               </w:rPr>
-              <w:t>entire day or 3- and 7-day moving averages</w:t>
+              <w:t xml:space="preserve"> was measured using a Picarro G2201-i Isotopic Analyzer</w:t>
             </w:r>
             <w:r>
               <w:rPr>
@@ -5678,7 +5673,7 @@
                 <w:sz w:val="20"/>
                 <w:szCs w:val="20"/>
               </w:rPr>
-              <w:t>.</w:t>
+              <w:t xml:space="preserve">, using the high precision mode for floating chamber samples and on the high range reading for diluted bubble samples. </w:t>
             </w:r>
           </w:p>
         </w:tc>
@@ -5710,7 +5705,6 @@
                 <w:sz w:val="20"/>
                 <w:szCs w:val="20"/>
               </w:rPr>
-              <w:lastRenderedPageBreak/>
               <w:t>Laboratory, field, or other analytical methods –</w:t>
             </w:r>
           </w:p>
@@ -5745,7 +5739,7 @@
                 <w:sz w:val="20"/>
                 <w:szCs w:val="20"/>
               </w:rPr>
-              <w:t>5</w:t>
+              <w:t>6</w:t>
             </w:r>
             <w:r>
               <w:rPr>
@@ -5767,7 +5761,7 @@
                 <w:sz w:val="20"/>
                 <w:szCs w:val="20"/>
               </w:rPr>
-              <w:t>CH4Isotopes</w:t>
+              <w:t>WaterChem</w:t>
             </w:r>
             <w:r>
               <w:rPr>
@@ -5811,7 +5805,7 @@
                 <w:sz w:val="20"/>
                 <w:szCs w:val="20"/>
               </w:rPr>
-              <w:t xml:space="preserve">d13C-CH4: </w:t>
+              <w:t>DOC; TOC; TC; TIC; TN:</w:t>
             </w:r>
             <w:r>
               <w:rPr>
@@ -5821,7 +5815,7 @@
                 <w:sz w:val="20"/>
                 <w:szCs w:val="20"/>
               </w:rPr>
-              <w:t xml:space="preserve">stable carbon </w:t>
+              <w:t xml:space="preserve"> </w:t>
             </w:r>
             <w:r>
               <w:rPr>
@@ -5831,7 +5825,7 @@
                 <w:sz w:val="20"/>
                 <w:szCs w:val="20"/>
               </w:rPr>
-              <w:t xml:space="preserve">isotopic composition </w:t>
+              <w:t>analyses conducted</w:t>
             </w:r>
             <w:r>
               <w:rPr>
@@ -5841,7 +5835,7 @@
                 <w:sz w:val="20"/>
                 <w:szCs w:val="20"/>
               </w:rPr>
-              <w:t>of CH</w:t>
+              <w:t xml:space="preserve"> using</w:t>
             </w:r>
             <w:r>
               <w:rPr>
@@ -5850,9 +5844,8 @@
                 <w:color w:val="000000" w:themeColor="text1"/>
                 <w:sz w:val="20"/>
                 <w:szCs w:val="20"/>
-                <w:vertAlign w:val="subscript"/>
-              </w:rPr>
-              <w:t>4</w:t>
+              </w:rPr>
+              <w:t xml:space="preserve"> a </w:t>
             </w:r>
             <w:r>
               <w:rPr>
@@ -5862,124 +5855,9 @@
                 <w:sz w:val="20"/>
                 <w:szCs w:val="20"/>
               </w:rPr>
-              <w:t xml:space="preserve"> was measured using a Picarro G2201-i Isotopic Analyzer</w:t>
-            </w:r>
-            <w:r>
-              <w:rPr>
-                <w:rFonts w:asciiTheme="minorHAnsi" w:hAnsiTheme="minorHAnsi" w:cstheme="minorHAnsi"/>
-                <w:iCs/>
-                <w:color w:val="000000" w:themeColor="text1"/>
-                <w:sz w:val="20"/>
-                <w:szCs w:val="20"/>
-              </w:rPr>
-              <w:t xml:space="preserve">, using the high precision mode for floating chamber samples and on the high range reading for diluted bubble samples. </w:t>
-            </w:r>
-          </w:p>
-        </w:tc>
-      </w:tr>
-      <w:tr>
-        <w:trPr>
-          <w:jc w:val="center"/>
-        </w:trPr>
-        <w:tc>
-          <w:tcPr>
-            <w:tcW w:w="3268" w:type="dxa"/>
-            <w:vAlign w:val="center"/>
-          </w:tcPr>
-          <w:p>
-            <w:pPr>
-              <w:pStyle w:val="NormalWeb"/>
-              <w:contextualSpacing/>
-              <w:rPr>
-                <w:rFonts w:asciiTheme="minorHAnsi" w:hAnsiTheme="minorHAnsi" w:cstheme="minorHAnsi"/>
-                <w:b/>
-                <w:sz w:val="20"/>
-                <w:szCs w:val="20"/>
-              </w:rPr>
-            </w:pPr>
-            <w:r>
-              <w:rPr>
-                <w:rFonts w:asciiTheme="minorHAnsi" w:hAnsiTheme="minorHAnsi" w:cstheme="minorHAnsi"/>
-                <w:b/>
-                <w:sz w:val="20"/>
-                <w:szCs w:val="20"/>
-              </w:rPr>
-              <w:t>Laboratory, field, or other analytical methods –</w:t>
-            </w:r>
-          </w:p>
-          <w:p>
-            <w:pPr>
-              <w:pStyle w:val="NormalWeb"/>
-              <w:contextualSpacing/>
-              <w:rPr>
-                <w:rFonts w:asciiTheme="minorHAnsi" w:hAnsiTheme="minorHAnsi" w:cstheme="minorHAnsi"/>
-                <w:b/>
-                <w:sz w:val="20"/>
-                <w:szCs w:val="20"/>
-              </w:rPr>
-            </w:pPr>
-            <w:r>
-              <w:rPr>
-                <w:rFonts w:asciiTheme="minorHAnsi" w:hAnsiTheme="minorHAnsi" w:cstheme="minorHAnsi"/>
-                <w:b/>
-                <w:i/>
-                <w:iCs/>
-                <w:sz w:val="20"/>
-                <w:szCs w:val="20"/>
-              </w:rPr>
-              <w:t>Data</w:t>
-            </w:r>
-            <w:r>
-              <w:rPr>
-                <w:rFonts w:asciiTheme="minorHAnsi" w:hAnsiTheme="minorHAnsi" w:cstheme="minorHAnsi"/>
-                <w:b/>
-                <w:i/>
-                <w:iCs/>
-                <w:sz w:val="20"/>
-                <w:szCs w:val="20"/>
-              </w:rPr>
-              <w:t>6</w:t>
-            </w:r>
-            <w:r>
-              <w:rPr>
-                <w:rFonts w:asciiTheme="minorHAnsi" w:hAnsiTheme="minorHAnsi" w:cstheme="minorHAnsi"/>
-                <w:b/>
-                <w:i/>
-                <w:iCs/>
-                <w:sz w:val="20"/>
-                <w:szCs w:val="20"/>
-              </w:rPr>
-              <w:t>_</w:t>
-            </w:r>
-            <w:r>
-              <w:rPr>
-                <w:rFonts w:asciiTheme="minorHAnsi" w:hAnsiTheme="minorHAnsi" w:cstheme="minorHAnsi"/>
-                <w:b/>
-                <w:i/>
-                <w:iCs/>
-                <w:sz w:val="20"/>
-                <w:szCs w:val="20"/>
-              </w:rPr>
-              <w:t>WaterChem</w:t>
-            </w:r>
-            <w:r>
-              <w:rPr>
-                <w:rFonts w:asciiTheme="minorHAnsi" w:hAnsiTheme="minorHAnsi" w:cstheme="minorHAnsi"/>
-                <w:b/>
-                <w:i/>
-                <w:iCs/>
-                <w:sz w:val="20"/>
-                <w:szCs w:val="20"/>
-              </w:rPr>
-              <w:t>.csv</w:t>
-            </w:r>
-          </w:p>
-        </w:tc>
-        <w:tc>
-          <w:tcPr>
-            <w:tcW w:w="6740" w:type="dxa"/>
-            <w:vAlign w:val="center"/>
-          </w:tcPr>
+              <w:t>Shimadzu TOC-L CPH Model Total Organic Carbon Analyzer with an ASI-L and TNM-L</w:t>
+            </w:r>
+          </w:p>
           <w:p>
             <w:pPr>
               <w:pStyle w:val="NormalWeb"/>
@@ -6004,7 +5882,7 @@
                 <w:sz w:val="20"/>
                 <w:szCs w:val="20"/>
               </w:rPr>
-              <w:t>DOC; TOC; TC; TIC; TN:</w:t>
+              <w:t xml:space="preserve">SO4-S; </w:t>
             </w:r>
             <w:r>
               <w:rPr>
@@ -6014,7 +5892,7 @@
                 <w:sz w:val="20"/>
                 <w:szCs w:val="20"/>
               </w:rPr>
-              <w:t xml:space="preserve"> </w:t>
+              <w:t xml:space="preserve">NO3-N; </w:t>
             </w:r>
             <w:r>
               <w:rPr>
@@ -6024,7 +5902,7 @@
                 <w:sz w:val="20"/>
                 <w:szCs w:val="20"/>
               </w:rPr>
-              <w:t>analyses conducted</w:t>
+              <w:t>NO2-N;</w:t>
             </w:r>
             <w:r>
               <w:rPr>
@@ -6034,7 +5912,7 @@
                 <w:sz w:val="20"/>
                 <w:szCs w:val="20"/>
               </w:rPr>
-              <w:t xml:space="preserve"> using</w:t>
+              <w:t xml:space="preserve"> </w:t>
             </w:r>
             <w:r>
               <w:rPr>
@@ -6044,7 +5922,7 @@
                 <w:sz w:val="20"/>
                 <w:szCs w:val="20"/>
               </w:rPr>
-              <w:t xml:space="preserve"> a </w:t>
+              <w:t xml:space="preserve">PO4-P; </w:t>
             </w:r>
             <w:r>
               <w:rPr>
@@ -6054,7 +5932,135 @@
                 <w:sz w:val="20"/>
                 <w:szCs w:val="20"/>
               </w:rPr>
-              <w:t>Shimadzu TOC-L CPH Model Total Organic Carbon Analyzer with an ASI-L and TNM-L</w:t>
+              <w:t>NH4-N</w:t>
+            </w:r>
+            <w:r>
+              <w:rPr>
+                <w:rFonts w:asciiTheme="minorHAnsi" w:hAnsiTheme="minorHAnsi" w:cstheme="minorHAnsi"/>
+                <w:iCs/>
+                <w:color w:val="000000" w:themeColor="text1"/>
+                <w:sz w:val="20"/>
+                <w:szCs w:val="20"/>
+              </w:rPr>
+              <w:t>; F; Cl; Br</w:t>
+            </w:r>
+            <w:r>
+              <w:rPr>
+                <w:rFonts w:asciiTheme="minorHAnsi" w:hAnsiTheme="minorHAnsi" w:cstheme="minorHAnsi"/>
+                <w:iCs/>
+                <w:color w:val="000000" w:themeColor="text1"/>
+                <w:sz w:val="20"/>
+                <w:szCs w:val="20"/>
+              </w:rPr>
+              <w:t>:</w:t>
+            </w:r>
+            <w:r>
+              <w:rPr>
+                <w:rFonts w:asciiTheme="minorHAnsi" w:hAnsiTheme="minorHAnsi" w:cstheme="minorHAnsi"/>
+                <w:iCs/>
+                <w:color w:val="000000" w:themeColor="text1"/>
+                <w:sz w:val="20"/>
+                <w:szCs w:val="20"/>
+              </w:rPr>
+              <w:t xml:space="preserve"> </w:t>
+            </w:r>
+            <w:r>
+              <w:rPr>
+                <w:rFonts w:asciiTheme="minorHAnsi" w:hAnsiTheme="minorHAnsi" w:cstheme="minorHAnsi"/>
+                <w:iCs/>
+                <w:color w:val="000000" w:themeColor="text1"/>
+                <w:sz w:val="20"/>
+                <w:szCs w:val="20"/>
+              </w:rPr>
+              <w:t>analyses conducted</w:t>
+            </w:r>
+            <w:r>
+              <w:rPr>
+                <w:rFonts w:asciiTheme="minorHAnsi" w:hAnsiTheme="minorHAnsi" w:cstheme="minorHAnsi"/>
+                <w:iCs/>
+                <w:color w:val="000000" w:themeColor="text1"/>
+                <w:sz w:val="20"/>
+                <w:szCs w:val="20"/>
+              </w:rPr>
+              <w:t xml:space="preserve"> using </w:t>
+            </w:r>
+            <w:r>
+              <w:rPr>
+                <w:rFonts w:asciiTheme="minorHAnsi" w:hAnsiTheme="minorHAnsi" w:cstheme="minorHAnsi"/>
+                <w:iCs/>
+                <w:color w:val="000000" w:themeColor="text1"/>
+                <w:sz w:val="20"/>
+                <w:szCs w:val="20"/>
+              </w:rPr>
+              <w:t xml:space="preserve">colour reactions through the </w:t>
+            </w:r>
+            <w:r>
+              <w:rPr>
+                <w:rFonts w:asciiTheme="minorHAnsi" w:hAnsiTheme="minorHAnsi" w:cstheme="minorHAnsi"/>
+                <w:bCs/>
+                <w:iCs/>
+                <w:color w:val="000000" w:themeColor="text1"/>
+                <w:sz w:val="20"/>
+                <w:szCs w:val="20"/>
+                <w:lang w:val="en-CA"/>
+              </w:rPr>
+              <w:t>Thermo Gallery Plus Beermaster Autoanalyzer</w:t>
+            </w:r>
+            <w:r>
+              <w:rPr>
+                <w:rFonts w:asciiTheme="minorHAnsi" w:hAnsiTheme="minorHAnsi" w:cstheme="minorHAnsi"/>
+                <w:bCs/>
+                <w:iCs/>
+                <w:color w:val="000000" w:themeColor="text1"/>
+                <w:sz w:val="20"/>
+                <w:szCs w:val="20"/>
+                <w:lang w:val="en-CA"/>
+              </w:rPr>
+              <w:t xml:space="preserve">, </w:t>
+            </w:r>
+            <w:r>
+              <w:rPr>
+                <w:rFonts w:asciiTheme="minorHAnsi" w:hAnsiTheme="minorHAnsi" w:cstheme="minorHAnsi"/>
+                <w:bCs/>
+                <w:iCs/>
+                <w:color w:val="000000" w:themeColor="text1"/>
+                <w:sz w:val="20"/>
+                <w:szCs w:val="20"/>
+              </w:rPr>
+              <w:t>ThermoScientific Dionex, Inuvion Ion Chromatographer (IC)</w:t>
+            </w:r>
+            <w:r>
+              <w:rPr>
+                <w:rFonts w:asciiTheme="minorHAnsi" w:hAnsiTheme="minorHAnsi" w:cstheme="minorHAnsi"/>
+                <w:bCs/>
+                <w:iCs/>
+                <w:color w:val="000000" w:themeColor="text1"/>
+                <w:sz w:val="20"/>
+                <w:szCs w:val="20"/>
+              </w:rPr>
+              <w:t xml:space="preserve">, and </w:t>
+            </w:r>
+            <w:r>
+              <w:rPr>
+                <w:rFonts w:asciiTheme="minorHAnsi" w:hAnsiTheme="minorHAnsi" w:cstheme="minorHAnsi"/>
+                <w:bCs/>
+                <w:iCs/>
+                <w:color w:val="000000" w:themeColor="text1"/>
+                <w:sz w:val="20"/>
+                <w:szCs w:val="20"/>
+              </w:rPr>
+              <w:t xml:space="preserve">the </w:t>
+            </w:r>
+            <w:r>
+              <w:rPr>
+                <w:rFonts w:asciiTheme="minorHAnsi" w:hAnsiTheme="minorHAnsi" w:cstheme="minorHAnsi"/>
+                <w:bCs/>
+                <w:iCs/>
+                <w:color w:val="000000" w:themeColor="text1"/>
+                <w:sz w:val="20"/>
+                <w:szCs w:val="20"/>
+              </w:rPr>
+              <w:t>ThermoScientific Dionex, AS-AP Autosampler</w:t>
             </w:r>
           </w:p>
           <w:p>
@@ -6081,7 +6087,7 @@
                 <w:sz w:val="20"/>
                 <w:szCs w:val="20"/>
               </w:rPr>
-              <w:t xml:space="preserve">SO4-S; </w:t>
+              <w:t xml:space="preserve">Dissolved Metals, S, and P: </w:t>
             </w:r>
             <w:r>
               <w:rPr>
@@ -6091,7 +6097,7 @@
                 <w:sz w:val="20"/>
                 <w:szCs w:val="20"/>
               </w:rPr>
-              <w:t xml:space="preserve">NO3-N; </w:t>
+              <w:t xml:space="preserve">analyses conducted using the </w:t>
             </w:r>
             <w:r>
               <w:rPr>
@@ -6101,167 +6107,114 @@
                 <w:sz w:val="20"/>
                 <w:szCs w:val="20"/>
               </w:rPr>
-              <w:t>NO2-N;</w:t>
-            </w:r>
-            <w:r>
-              <w:rPr>
-                <w:rFonts w:asciiTheme="minorHAnsi" w:hAnsiTheme="minorHAnsi" w:cstheme="minorHAnsi"/>
+              <w:t>Thermo iCAP Pro Duo (N. America) inductively coupled plasma-optical emission spectrometer (ICP-OES)</w:t>
+            </w:r>
+          </w:p>
+        </w:tc>
+      </w:tr>
+      <w:tr>
+        <w:trPr>
+          <w:jc w:val="center"/>
+        </w:trPr>
+        <w:tc>
+          <w:tcPr>
+            <w:tcW w:w="3268" w:type="dxa"/>
+            <w:vAlign w:val="center"/>
+          </w:tcPr>
+          <w:p>
+            <w:pPr>
+              <w:pStyle w:val="NormalWeb"/>
+              <w:contextualSpacing/>
+              <w:rPr>
+                <w:rFonts w:asciiTheme="minorHAnsi" w:hAnsiTheme="minorHAnsi" w:cstheme="minorHAnsi"/>
+                <w:b/>
+                <w:sz w:val="20"/>
+                <w:szCs w:val="20"/>
+              </w:rPr>
+            </w:pPr>
+            <w:r>
+              <w:rPr>
+                <w:rFonts w:asciiTheme="minorHAnsi" w:hAnsiTheme="minorHAnsi" w:cstheme="minorHAnsi"/>
+                <w:b/>
+                <w:sz w:val="20"/>
+                <w:szCs w:val="20"/>
+              </w:rPr>
+              <w:t>Laboratory, field, or other analytical methods –</w:t>
+            </w:r>
+          </w:p>
+          <w:p>
+            <w:pPr>
+              <w:pStyle w:val="NormalWeb"/>
+              <w:contextualSpacing/>
+              <w:rPr>
+                <w:rFonts w:asciiTheme="minorHAnsi" w:hAnsiTheme="minorHAnsi" w:cstheme="minorHAnsi"/>
+                <w:b/>
+                <w:sz w:val="20"/>
+                <w:szCs w:val="20"/>
+              </w:rPr>
+            </w:pPr>
+            <w:r>
+              <w:rPr>
+                <w:rFonts w:asciiTheme="minorHAnsi" w:hAnsiTheme="minorHAnsi" w:cstheme="minorHAnsi"/>
+                <w:b/>
+                <w:i/>
                 <w:iCs/>
-                <w:color w:val="000000" w:themeColor="text1"/>
-                <w:sz w:val="20"/>
-                <w:szCs w:val="20"/>
-              </w:rPr>
-              <w:t xml:space="preserve"> </w:t>
-            </w:r>
-            <w:r>
-              <w:rPr>
-                <w:rFonts w:asciiTheme="minorHAnsi" w:hAnsiTheme="minorHAnsi" w:cstheme="minorHAnsi"/>
+                <w:sz w:val="20"/>
+                <w:szCs w:val="20"/>
+              </w:rPr>
+              <w:t>Data</w:t>
+            </w:r>
+            <w:r>
+              <w:rPr>
+                <w:rFonts w:asciiTheme="minorHAnsi" w:hAnsiTheme="minorHAnsi" w:cstheme="minorHAnsi"/>
+                <w:b/>
+                <w:i/>
                 <w:iCs/>
-                <w:color w:val="000000" w:themeColor="text1"/>
-                <w:sz w:val="20"/>
-                <w:szCs w:val="20"/>
-              </w:rPr>
-              <w:t xml:space="preserve">PO4-P; </w:t>
-            </w:r>
-            <w:r>
-              <w:rPr>
-                <w:rFonts w:asciiTheme="minorHAnsi" w:hAnsiTheme="minorHAnsi" w:cstheme="minorHAnsi"/>
+                <w:sz w:val="20"/>
+                <w:szCs w:val="20"/>
+              </w:rPr>
+              <w:t>7</w:t>
+            </w:r>
+            <w:r>
+              <w:rPr>
+                <w:rFonts w:asciiTheme="minorHAnsi" w:hAnsiTheme="minorHAnsi" w:cstheme="minorHAnsi"/>
+                <w:b/>
+                <w:i/>
                 <w:iCs/>
-                <w:color w:val="000000" w:themeColor="text1"/>
-                <w:sz w:val="20"/>
-                <w:szCs w:val="20"/>
-              </w:rPr>
-              <w:t>NH4-N</w:t>
-            </w:r>
-            <w:r>
-              <w:rPr>
-                <w:rFonts w:asciiTheme="minorHAnsi" w:hAnsiTheme="minorHAnsi" w:cstheme="minorHAnsi"/>
+                <w:sz w:val="20"/>
+                <w:szCs w:val="20"/>
+              </w:rPr>
+              <w:t>_</w:t>
+            </w:r>
+            <w:r>
+              <w:rPr>
+                <w:rFonts w:asciiTheme="minorHAnsi" w:hAnsiTheme="minorHAnsi" w:cstheme="minorHAnsi"/>
+                <w:b/>
+                <w:i/>
                 <w:iCs/>
-                <w:color w:val="000000" w:themeColor="text1"/>
-                <w:sz w:val="20"/>
-                <w:szCs w:val="20"/>
-              </w:rPr>
-              <w:t>; F; Cl; Br</w:t>
-            </w:r>
-            <w:r>
-              <w:rPr>
-                <w:rFonts w:asciiTheme="minorHAnsi" w:hAnsiTheme="minorHAnsi" w:cstheme="minorHAnsi"/>
+                <w:sz w:val="20"/>
+                <w:szCs w:val="20"/>
+              </w:rPr>
+              <w:t>Incubation</w:t>
+            </w:r>
+            <w:r>
+              <w:rPr>
+                <w:rFonts w:asciiTheme="minorHAnsi" w:hAnsiTheme="minorHAnsi" w:cstheme="minorHAnsi"/>
+                <w:b/>
+                <w:i/>
                 <w:iCs/>
-                <w:color w:val="000000" w:themeColor="text1"/>
-                <w:sz w:val="20"/>
-                <w:szCs w:val="20"/>
-              </w:rPr>
-              <w:t>:</w:t>
-            </w:r>
-            <w:r>
-              <w:rPr>
-                <w:rFonts w:asciiTheme="minorHAnsi" w:hAnsiTheme="minorHAnsi" w:cstheme="minorHAnsi"/>
-                <w:iCs/>
-                <w:color w:val="000000" w:themeColor="text1"/>
-                <w:sz w:val="20"/>
-                <w:szCs w:val="20"/>
-              </w:rPr>
-              <w:t xml:space="preserve"> </w:t>
-            </w:r>
-            <w:r>
-              <w:rPr>
-                <w:rFonts w:asciiTheme="minorHAnsi" w:hAnsiTheme="minorHAnsi" w:cstheme="minorHAnsi"/>
-                <w:iCs/>
-                <w:color w:val="000000" w:themeColor="text1"/>
-                <w:sz w:val="20"/>
-                <w:szCs w:val="20"/>
-              </w:rPr>
-              <w:t>analyses conducted</w:t>
-            </w:r>
-            <w:r>
-              <w:rPr>
-                <w:rFonts w:asciiTheme="minorHAnsi" w:hAnsiTheme="minorHAnsi" w:cstheme="minorHAnsi"/>
-                <w:iCs/>
-                <w:color w:val="000000" w:themeColor="text1"/>
-                <w:sz w:val="20"/>
-                <w:szCs w:val="20"/>
-              </w:rPr>
-              <w:t xml:space="preserve"> using </w:t>
-            </w:r>
-            <w:r>
-              <w:rPr>
-                <w:rFonts w:asciiTheme="minorHAnsi" w:hAnsiTheme="minorHAnsi" w:cstheme="minorHAnsi"/>
-                <w:iCs/>
-                <w:color w:val="000000" w:themeColor="text1"/>
-                <w:sz w:val="20"/>
-                <w:szCs w:val="20"/>
-              </w:rPr>
-              <w:t xml:space="preserve">colour reactions through the </w:t>
-            </w:r>
-            <w:r>
-              <w:rPr>
-                <w:rFonts w:asciiTheme="minorHAnsi" w:hAnsiTheme="minorHAnsi" w:cstheme="minorHAnsi"/>
-                <w:bCs/>
-                <w:iCs/>
-                <w:color w:val="000000" w:themeColor="text1"/>
-                <w:sz w:val="20"/>
-                <w:szCs w:val="20"/>
-                <w:lang w:val="en-CA"/>
-              </w:rPr>
-              <w:t>Thermo Gallery Plus Beermaster Autoanalyzer</w:t>
-            </w:r>
-            <w:r>
-              <w:rPr>
-                <w:rFonts w:asciiTheme="minorHAnsi" w:hAnsiTheme="minorHAnsi" w:cstheme="minorHAnsi"/>
-                <w:bCs/>
-                <w:iCs/>
-                <w:color w:val="000000" w:themeColor="text1"/>
-                <w:sz w:val="20"/>
-                <w:szCs w:val="20"/>
-                <w:lang w:val="en-CA"/>
-              </w:rPr>
-              <w:t xml:space="preserve">, </w:t>
-            </w:r>
-            <w:r>
-              <w:rPr>
-                <w:rFonts w:asciiTheme="minorHAnsi" w:hAnsiTheme="minorHAnsi" w:cstheme="minorHAnsi"/>
-                <w:bCs/>
-                <w:iCs/>
-                <w:color w:val="000000" w:themeColor="text1"/>
-                <w:sz w:val="20"/>
-                <w:szCs w:val="20"/>
-              </w:rPr>
-              <w:t>ThermoScientific Dionex, Inuvion Ion Chromatographer (IC)</w:t>
-            </w:r>
-            <w:r>
-              <w:rPr>
-                <w:rFonts w:asciiTheme="minorHAnsi" w:hAnsiTheme="minorHAnsi" w:cstheme="minorHAnsi"/>
-                <w:bCs/>
-                <w:iCs/>
-                <w:color w:val="000000" w:themeColor="text1"/>
-                <w:sz w:val="20"/>
-                <w:szCs w:val="20"/>
-              </w:rPr>
-              <w:t xml:space="preserve">, and </w:t>
-            </w:r>
-            <w:r>
-              <w:rPr>
-                <w:rFonts w:asciiTheme="minorHAnsi" w:hAnsiTheme="minorHAnsi" w:cstheme="minorHAnsi"/>
-                <w:bCs/>
-                <w:iCs/>
-                <w:color w:val="000000" w:themeColor="text1"/>
-                <w:sz w:val="20"/>
-                <w:szCs w:val="20"/>
-              </w:rPr>
-              <w:t xml:space="preserve">the </w:t>
-            </w:r>
-            <w:r>
-              <w:rPr>
-                <w:rFonts w:asciiTheme="minorHAnsi" w:hAnsiTheme="minorHAnsi" w:cstheme="minorHAnsi"/>
-                <w:bCs/>
-                <w:iCs/>
-                <w:color w:val="000000" w:themeColor="text1"/>
-                <w:sz w:val="20"/>
-                <w:szCs w:val="20"/>
-              </w:rPr>
-              <w:t>ThermoScientific Dionex, AS-AP Autosampler</w:t>
-            </w:r>
-          </w:p>
+                <w:sz w:val="20"/>
+                <w:szCs w:val="20"/>
+              </w:rPr>
+              <w:t>.csv</w:t>
+            </w:r>
+          </w:p>
+        </w:tc>
+        <w:tc>
+          <w:tcPr>
+            <w:tcW w:w="6740" w:type="dxa"/>
+            <w:vAlign w:val="center"/>
+          </w:tcPr>
           <w:p>
             <w:pPr>
               <w:pStyle w:val="NormalWeb"/>
@@ -6286,7 +6239,7 @@
                 <w:sz w:val="20"/>
                 <w:szCs w:val="20"/>
               </w:rPr>
-              <w:t xml:space="preserve">Dissolved Metals, S, and P: </w:t>
+              <w:t>Potential CH4 Production:</w:t>
             </w:r>
             <w:r>
               <w:rPr>
@@ -6296,7 +6249,7 @@
                 <w:sz w:val="20"/>
                 <w:szCs w:val="20"/>
               </w:rPr>
-              <w:t xml:space="preserve">analyses conducted using the </w:t>
+              <w:t xml:space="preserve"> calculated from</w:t>
             </w:r>
             <w:r>
               <w:rPr>
@@ -6306,115 +6259,100 @@
                 <w:sz w:val="20"/>
                 <w:szCs w:val="20"/>
               </w:rPr>
-              <w:t>Thermo iCAP Pro Duo (N. America) inductively coupled plasma-optical emission spectrometer (ICP-OES)</w:t>
-            </w:r>
-          </w:p>
-        </w:tc>
-      </w:tr>
-      <w:tr>
-        <w:trPr>
-          <w:jc w:val="center"/>
-        </w:trPr>
-        <w:tc>
-          <w:tcPr>
-            <w:tcW w:w="3268" w:type="dxa"/>
-            <w:vAlign w:val="center"/>
-          </w:tcPr>
-          <w:p>
-            <w:pPr>
-              <w:pStyle w:val="NormalWeb"/>
-              <w:contextualSpacing/>
-              <w:rPr>
-                <w:rFonts w:asciiTheme="minorHAnsi" w:hAnsiTheme="minorHAnsi" w:cstheme="minorHAnsi"/>
-                <w:b/>
-                <w:sz w:val="20"/>
-                <w:szCs w:val="20"/>
-              </w:rPr>
-            </w:pPr>
-            <w:r>
-              <w:rPr>
-                <w:rFonts w:asciiTheme="minorHAnsi" w:hAnsiTheme="minorHAnsi" w:cstheme="minorHAnsi"/>
-                <w:b/>
-                <w:sz w:val="20"/>
-                <w:szCs w:val="20"/>
-              </w:rPr>
-              <w:lastRenderedPageBreak/>
-              <w:t>Laboratory, field, or other analytical methods –</w:t>
-            </w:r>
-          </w:p>
-          <w:p>
-            <w:pPr>
-              <w:pStyle w:val="NormalWeb"/>
-              <w:contextualSpacing/>
-              <w:rPr>
-                <w:rFonts w:asciiTheme="minorHAnsi" w:hAnsiTheme="minorHAnsi" w:cstheme="minorHAnsi"/>
-                <w:b/>
-                <w:sz w:val="20"/>
-                <w:szCs w:val="20"/>
-              </w:rPr>
-            </w:pPr>
-            <w:r>
-              <w:rPr>
-                <w:rFonts w:asciiTheme="minorHAnsi" w:hAnsiTheme="minorHAnsi" w:cstheme="minorHAnsi"/>
-                <w:b/>
-                <w:i/>
+              <w:t xml:space="preserve"> the change in</w:t>
+            </w:r>
+            <w:r>
+              <w:rPr>
+                <w:rFonts w:asciiTheme="minorHAnsi" w:hAnsiTheme="minorHAnsi" w:cstheme="minorHAnsi"/>
                 <w:iCs/>
-                <w:sz w:val="20"/>
-                <w:szCs w:val="20"/>
-              </w:rPr>
-              <w:t>Data</w:t>
-            </w:r>
-            <w:r>
-              <w:rPr>
-                <w:rFonts w:asciiTheme="minorHAnsi" w:hAnsiTheme="minorHAnsi" w:cstheme="minorHAnsi"/>
-                <w:b/>
-                <w:i/>
+                <w:color w:val="000000" w:themeColor="text1"/>
+                <w:sz w:val="20"/>
+                <w:szCs w:val="20"/>
+              </w:rPr>
+              <w:t xml:space="preserve"> headspace CH</w:t>
+            </w:r>
+            <w:r>
+              <w:rPr>
+                <w:rFonts w:asciiTheme="minorHAnsi" w:hAnsiTheme="minorHAnsi" w:cstheme="minorHAnsi"/>
                 <w:iCs/>
-                <w:sz w:val="20"/>
-                <w:szCs w:val="20"/>
-              </w:rPr>
-              <w:t>7</w:t>
-            </w:r>
-            <w:r>
-              <w:rPr>
-                <w:rFonts w:asciiTheme="minorHAnsi" w:hAnsiTheme="minorHAnsi" w:cstheme="minorHAnsi"/>
-                <w:b/>
-                <w:i/>
+                <w:color w:val="000000" w:themeColor="text1"/>
+                <w:sz w:val="20"/>
+                <w:szCs w:val="20"/>
+                <w:vertAlign w:val="subscript"/>
+              </w:rPr>
+              <w:t>4</w:t>
+            </w:r>
+            <w:r>
+              <w:rPr>
+                <w:rFonts w:asciiTheme="minorHAnsi" w:hAnsiTheme="minorHAnsi" w:cstheme="minorHAnsi"/>
                 <w:iCs/>
-                <w:sz w:val="20"/>
-                <w:szCs w:val="20"/>
-              </w:rPr>
-              <w:t>_</w:t>
-            </w:r>
-            <w:r>
-              <w:rPr>
-                <w:rFonts w:asciiTheme="minorHAnsi" w:hAnsiTheme="minorHAnsi" w:cstheme="minorHAnsi"/>
-                <w:b/>
-                <w:i/>
+                <w:color w:val="000000" w:themeColor="text1"/>
+                <w:sz w:val="20"/>
+                <w:szCs w:val="20"/>
+              </w:rPr>
+              <w:t xml:space="preserve"> concentration </w:t>
+            </w:r>
+            <w:r>
+              <w:rPr>
+                <w:rFonts w:asciiTheme="minorHAnsi" w:hAnsiTheme="minorHAnsi" w:cstheme="minorHAnsi"/>
                 <w:iCs/>
-                <w:sz w:val="20"/>
-                <w:szCs w:val="20"/>
-              </w:rPr>
-              <w:t>Incubation</w:t>
-            </w:r>
-            <w:r>
-              <w:rPr>
-                <w:rFonts w:asciiTheme="minorHAnsi" w:hAnsiTheme="minorHAnsi" w:cstheme="minorHAnsi"/>
-                <w:b/>
-                <w:i/>
+                <w:color w:val="000000" w:themeColor="text1"/>
+                <w:sz w:val="20"/>
+                <w:szCs w:val="20"/>
+              </w:rPr>
+              <w:t xml:space="preserve">between sample days </w:t>
+            </w:r>
+            <w:r>
+              <w:rPr>
+                <w:rFonts w:asciiTheme="minorHAnsi" w:hAnsiTheme="minorHAnsi" w:cstheme="minorHAnsi"/>
                 <w:iCs/>
-                <w:sz w:val="20"/>
-                <w:szCs w:val="20"/>
-              </w:rPr>
-              <w:t>.csv</w:t>
-            </w:r>
-          </w:p>
-        </w:tc>
-        <w:tc>
-          <w:tcPr>
-            <w:tcW w:w="6740" w:type="dxa"/>
-            <w:vAlign w:val="center"/>
-          </w:tcPr>
+                <w:color w:val="000000" w:themeColor="text1"/>
+                <w:sz w:val="20"/>
+                <w:szCs w:val="20"/>
+              </w:rPr>
+              <w:t xml:space="preserve">as measured by </w:t>
+            </w:r>
+            <w:r>
+              <w:rPr>
+                <w:rFonts w:asciiTheme="minorHAnsi" w:hAnsiTheme="minorHAnsi" w:cstheme="minorHAnsi"/>
+                <w:iCs/>
+                <w:color w:val="000000" w:themeColor="text1"/>
+                <w:sz w:val="20"/>
+                <w:szCs w:val="20"/>
+              </w:rPr>
+              <w:t>the</w:t>
+            </w:r>
+            <w:r>
+              <w:rPr>
+                <w:rFonts w:asciiTheme="minorHAnsi" w:hAnsiTheme="minorHAnsi" w:cstheme="minorHAnsi"/>
+                <w:iCs/>
+                <w:color w:val="000000" w:themeColor="text1"/>
+                <w:sz w:val="20"/>
+                <w:szCs w:val="20"/>
+              </w:rPr>
+              <w:t xml:space="preserve"> LI-7810</w:t>
+            </w:r>
+            <w:r>
+              <w:rPr>
+                <w:rFonts w:asciiTheme="minorHAnsi" w:hAnsiTheme="minorHAnsi" w:cstheme="minorHAnsi"/>
+                <w:iCs/>
+                <w:color w:val="000000" w:themeColor="text1"/>
+                <w:sz w:val="20"/>
+                <w:szCs w:val="20"/>
+              </w:rPr>
+              <w:t xml:space="preserve">, </w:t>
+            </w:r>
+            <w:r>
+              <w:rPr>
+                <w:rFonts w:asciiTheme="minorHAnsi" w:hAnsiTheme="minorHAnsi" w:cstheme="minorHAnsi"/>
+                <w:iCs/>
+                <w:color w:val="000000" w:themeColor="text1"/>
+                <w:sz w:val="20"/>
+                <w:szCs w:val="20"/>
+              </w:rPr>
+              <w:t xml:space="preserve">the headspace volume, temperate and pressure. Production rates were normalized over the dry weight of material within the vials. </w:t>
+            </w:r>
+          </w:p>
           <w:p>
             <w:pPr>
               <w:pStyle w:val="NormalWeb"/>
@@ -6439,7 +6377,7 @@
                 <w:sz w:val="20"/>
                 <w:szCs w:val="20"/>
               </w:rPr>
-              <w:t>Potential CH4 Production:</w:t>
+              <w:t>Log Potential CH4 Production:</w:t>
             </w:r>
             <w:r>
               <w:rPr>
@@ -6449,7 +6387,7 @@
                 <w:sz w:val="20"/>
                 <w:szCs w:val="20"/>
               </w:rPr>
-              <w:t xml:space="preserve"> calculated from</w:t>
+              <w:t xml:space="preserve"> log-transformed potential CH</w:t>
             </w:r>
             <w:r>
               <w:rPr>
@@ -6458,8 +6396,9 @@
                 <w:color w:val="000000" w:themeColor="text1"/>
                 <w:sz w:val="20"/>
                 <w:szCs w:val="20"/>
-              </w:rPr>
-              <w:t xml:space="preserve"> the change in</w:t>
+                <w:vertAlign w:val="subscript"/>
+              </w:rPr>
+              <w:t>4</w:t>
             </w:r>
             <w:r>
               <w:rPr>
@@ -6469,7 +6408,7 @@
                 <w:sz w:val="20"/>
                 <w:szCs w:val="20"/>
               </w:rPr>
-              <w:t xml:space="preserve"> headspace CH</w:t>
+              <w:t xml:space="preserve"> production rate </w:t>
             </w:r>
             <w:r>
               <w:rPr>
@@ -6478,9 +6417,8 @@
                 <w:color w:val="000000" w:themeColor="text1"/>
                 <w:sz w:val="20"/>
                 <w:szCs w:val="20"/>
-                <w:vertAlign w:val="subscript"/>
-              </w:rPr>
-              <w:t>4</w:t>
+              </w:rPr>
+              <w:t>based on the calculations from the potential CH</w:t>
             </w:r>
             <w:r>
               <w:rPr>
@@ -6489,8 +6427,9 @@
                 <w:color w:val="000000" w:themeColor="text1"/>
                 <w:sz w:val="20"/>
                 <w:szCs w:val="20"/>
-              </w:rPr>
-              <w:t xml:space="preserve"> concentration </w:t>
+                <w:vertAlign w:val="subscript"/>
+              </w:rPr>
+              <w:t>4</w:t>
             </w:r>
             <w:r>
               <w:rPr>
@@ -6500,57 +6439,7 @@
                 <w:sz w:val="20"/>
                 <w:szCs w:val="20"/>
               </w:rPr>
-              <w:t xml:space="preserve">between sample days </w:t>
-            </w:r>
-            <w:r>
-              <w:rPr>
-                <w:rFonts w:asciiTheme="minorHAnsi" w:hAnsiTheme="minorHAnsi" w:cstheme="minorHAnsi"/>
-                <w:iCs/>
-                <w:color w:val="000000" w:themeColor="text1"/>
-                <w:sz w:val="20"/>
-                <w:szCs w:val="20"/>
-              </w:rPr>
-              <w:t xml:space="preserve">as measured by </w:t>
-            </w:r>
-            <w:r>
-              <w:rPr>
-                <w:rFonts w:asciiTheme="minorHAnsi" w:hAnsiTheme="minorHAnsi" w:cstheme="minorHAnsi"/>
-                <w:iCs/>
-                <w:color w:val="000000" w:themeColor="text1"/>
-                <w:sz w:val="20"/>
-                <w:szCs w:val="20"/>
-              </w:rPr>
-              <w:t>the</w:t>
-            </w:r>
-            <w:r>
-              <w:rPr>
-                <w:rFonts w:asciiTheme="minorHAnsi" w:hAnsiTheme="minorHAnsi" w:cstheme="minorHAnsi"/>
-                <w:iCs/>
-                <w:color w:val="000000" w:themeColor="text1"/>
-                <w:sz w:val="20"/>
-                <w:szCs w:val="20"/>
-              </w:rPr>
-              <w:t xml:space="preserve"> LI-7810</w:t>
-            </w:r>
-            <w:r>
-              <w:rPr>
-                <w:rFonts w:asciiTheme="minorHAnsi" w:hAnsiTheme="minorHAnsi" w:cstheme="minorHAnsi"/>
-                <w:iCs/>
-                <w:color w:val="000000" w:themeColor="text1"/>
-                <w:sz w:val="20"/>
-                <w:szCs w:val="20"/>
-              </w:rPr>
-              <w:t xml:space="preserve">, </w:t>
-            </w:r>
-            <w:r>
-              <w:rPr>
-                <w:rFonts w:asciiTheme="minorHAnsi" w:hAnsiTheme="minorHAnsi" w:cstheme="minorHAnsi"/>
-                <w:iCs/>
-                <w:color w:val="000000" w:themeColor="text1"/>
-                <w:sz w:val="20"/>
-                <w:szCs w:val="20"/>
-              </w:rPr>
-              <w:t xml:space="preserve">the headspace volume, temperate and pressure. Production rates were normalized over the dry weight of material within the vials. </w:t>
+              <w:t xml:space="preserve"> production column.</w:t>
             </w:r>
           </w:p>
           <w:p>
@@ -6577,7 +6466,7 @@
                 <w:sz w:val="20"/>
                 <w:szCs w:val="20"/>
               </w:rPr>
-              <w:t>Log Potential CH4 Production:</w:t>
+              <w:t>Pseudo-Log Potential CH4 Production: pseudo-log transformed potential CH</w:t>
             </w:r>
             <w:r>
               <w:rPr>
@@ -6586,8 +6475,9 @@
                 <w:color w:val="000000" w:themeColor="text1"/>
                 <w:sz w:val="20"/>
                 <w:szCs w:val="20"/>
-              </w:rPr>
-              <w:t xml:space="preserve"> log-transformed potential CH</w:t>
+                <w:vertAlign w:val="subscript"/>
+              </w:rPr>
+              <w:t>4</w:t>
             </w:r>
             <w:r>
               <w:rPr>
@@ -6596,9 +6486,8 @@
                 <w:color w:val="000000" w:themeColor="text1"/>
                 <w:sz w:val="20"/>
                 <w:szCs w:val="20"/>
-                <w:vertAlign w:val="subscript"/>
-              </w:rPr>
-              <w:t>4</w:t>
+              </w:rPr>
+              <w:t xml:space="preserve"> production </w:t>
             </w:r>
             <w:r>
               <w:rPr>
@@ -6608,7 +6497,7 @@
                 <w:sz w:val="20"/>
                 <w:szCs w:val="20"/>
               </w:rPr>
-              <w:t xml:space="preserve"> production rate </w:t>
+              <w:t>rates, which added 1 to the potential CH</w:t>
             </w:r>
             <w:r>
               <w:rPr>
@@ -6617,8 +6506,9 @@
                 <w:color w:val="000000" w:themeColor="text1"/>
                 <w:sz w:val="20"/>
                 <w:szCs w:val="20"/>
-              </w:rPr>
-              <w:t>based on the calculations from the potential CH</w:t>
+                <w:vertAlign w:val="subscript"/>
+              </w:rPr>
+              <w:t>4</w:t>
             </w:r>
             <w:r>
               <w:rPr>
@@ -6627,19 +6517,8 @@
                 <w:color w:val="000000" w:themeColor="text1"/>
                 <w:sz w:val="20"/>
                 <w:szCs w:val="20"/>
-                <w:vertAlign w:val="subscript"/>
-              </w:rPr>
-              <w:t>4</w:t>
-            </w:r>
-            <w:r>
-              <w:rPr>
-                <w:rFonts w:asciiTheme="minorHAnsi" w:hAnsiTheme="minorHAnsi" w:cstheme="minorHAnsi"/>
-                <w:iCs/>
-                <w:color w:val="000000" w:themeColor="text1"/>
-                <w:sz w:val="20"/>
-                <w:szCs w:val="20"/>
-              </w:rPr>
-              <w:t xml:space="preserve"> production column.</w:t>
+              </w:rPr>
+              <w:t xml:space="preserve"> production rates before transformation.</w:t>
             </w:r>
           </w:p>
           <w:p>
@@ -6666,7 +6545,8 @@
                 <w:sz w:val="20"/>
                 <w:szCs w:val="20"/>
               </w:rPr>
-              <w:t>Pseudo-Log Potential CH4 Production: pseudo-log transformed potential CH</w:t>
+              <w:lastRenderedPageBreak/>
+              <w:t>Organic Matter: the percent organic matter from selected vials as found through the Loss-on-Ignition method, where vials were first dried at 60</w:t>
             </w:r>
             <w:r>
               <w:rPr>
@@ -6675,9 +6555,8 @@
                 <w:color w:val="000000" w:themeColor="text1"/>
                 <w:sz w:val="20"/>
                 <w:szCs w:val="20"/>
-                <w:vertAlign w:val="subscript"/>
-              </w:rPr>
-              <w:t>4</w:t>
+              </w:rPr>
+              <w:sym w:font="Symbol" w:char="F0B0"/>
             </w:r>
             <w:r>
               <w:rPr>
@@ -6687,7 +6566,7 @@
                 <w:sz w:val="20"/>
                 <w:szCs w:val="20"/>
               </w:rPr>
-              <w:t xml:space="preserve"> production </w:t>
+              <w:t xml:space="preserve">C, then </w:t>
             </w:r>
             <w:r>
               <w:rPr>
@@ -6697,7 +6576,7 @@
                 <w:sz w:val="20"/>
                 <w:szCs w:val="20"/>
               </w:rPr>
-              <w:t>rates, which added 1 to the potential CH</w:t>
+              <w:t>placed within a muffle furnace at 500</w:t>
             </w:r>
             <w:r>
               <w:rPr>
@@ -6706,9 +6585,8 @@
                 <w:color w:val="000000" w:themeColor="text1"/>
                 <w:sz w:val="20"/>
                 <w:szCs w:val="20"/>
-                <w:vertAlign w:val="subscript"/>
-              </w:rPr>
-              <w:t>4</w:t>
+              </w:rPr>
+              <w:sym w:font="Symbol" w:char="F0B0"/>
             </w:r>
             <w:r>
               <w:rPr>
@@ -6718,7 +6596,7 @@
                 <w:sz w:val="20"/>
                 <w:szCs w:val="20"/>
               </w:rPr>
-              <w:t xml:space="preserve"> production rates before transformation.</w:t>
+              <w:t xml:space="preserve">C for 7 hours to find the percent of organic matter that was burned off. </w:t>
             </w:r>
           </w:p>
           <w:p>
@@ -6745,7 +6623,7 @@
                 <w:sz w:val="20"/>
                 <w:szCs w:val="20"/>
               </w:rPr>
-              <w:t>Organic Matter: the percent organic matter from selected vials as found through the Loss-on-Ignition method, where vials were first dried at 60</w:t>
+              <w:t>C</w:t>
             </w:r>
             <w:r>
               <w:rPr>
@@ -6755,7 +6633,7 @@
                 <w:sz w:val="20"/>
                 <w:szCs w:val="20"/>
               </w:rPr>
-              <w:sym w:font="Symbol" w:char="F0B0"/>
+              <w:t>/</w:t>
             </w:r>
             <w:r>
               <w:rPr>
@@ -6765,64 +6643,7 @@
                 <w:sz w:val="20"/>
                 <w:szCs w:val="20"/>
               </w:rPr>
-              <w:t xml:space="preserve">C, then </w:t>
-            </w:r>
-            <w:r>
-              <w:rPr>
-                <w:rFonts w:asciiTheme="minorHAnsi" w:hAnsiTheme="minorHAnsi" w:cstheme="minorHAnsi"/>
-                <w:iCs/>
-                <w:color w:val="000000" w:themeColor="text1"/>
-                <w:sz w:val="20"/>
-                <w:szCs w:val="20"/>
-              </w:rPr>
-              <w:t>placed within a muffle furnace at 500</w:t>
-            </w:r>
-            <w:r>
-              <w:rPr>
-                <w:rFonts w:asciiTheme="minorHAnsi" w:hAnsiTheme="minorHAnsi" w:cstheme="minorHAnsi"/>
-                <w:iCs/>
-                <w:color w:val="000000" w:themeColor="text1"/>
-                <w:sz w:val="20"/>
-                <w:szCs w:val="20"/>
-              </w:rPr>
-              <w:sym w:font="Symbol" w:char="F0B0"/>
-            </w:r>
-            <w:r>
-              <w:rPr>
-                <w:rFonts w:asciiTheme="minorHAnsi" w:hAnsiTheme="minorHAnsi" w:cstheme="minorHAnsi"/>
-                <w:iCs/>
-                <w:color w:val="000000" w:themeColor="text1"/>
-                <w:sz w:val="20"/>
-                <w:szCs w:val="20"/>
-              </w:rPr>
-              <w:t xml:space="preserve">C for 7 hours to find the percent of organic matter that was burned off. </w:t>
-            </w:r>
-          </w:p>
-          <w:p>
-            <w:pPr>
-              <w:pStyle w:val="NormalWeb"/>
-              <w:numPr>
-                <w:ilvl w:val="0"/>
-                <w:numId w:val="5"/>
-              </w:numPr>
-              <w:contextualSpacing/>
-              <w:rPr>
-                <w:rFonts w:asciiTheme="minorHAnsi" w:hAnsiTheme="minorHAnsi" w:cstheme="minorHAnsi"/>
-                <w:iCs/>
-                <w:color w:val="000000" w:themeColor="text1"/>
-                <w:sz w:val="20"/>
-                <w:szCs w:val="20"/>
-              </w:rPr>
-            </w:pPr>
-            <w:r>
-              <w:rPr>
-                <w:rFonts w:asciiTheme="minorHAnsi" w:hAnsiTheme="minorHAnsi" w:cstheme="minorHAnsi"/>
-                <w:iCs/>
-                <w:color w:val="000000" w:themeColor="text1"/>
-                <w:sz w:val="20"/>
-                <w:szCs w:val="20"/>
-              </w:rPr>
-              <w:t>C/N: Carbon to Nitrogen ratio that was calculated from total Carbon and Nitrogen values as measured by a CHN elemental analyzer.</w:t>
+              <w:t>N: Carbon to Nitrogen ratio that was calculated from total Carbon and Nitrogen values as measured by a CHN elemental analyzer.</w:t>
             </w:r>
           </w:p>
         </w:tc>
@@ -6854,6 +6675,7 @@
                 <w:sz w:val="20"/>
                 <w:szCs w:val="20"/>
               </w:rPr>
+              <w:lastRenderedPageBreak/>
               <w:t>Taxonomic species or groups</w:t>
             </w:r>
           </w:p>
@@ -8263,7 +8085,6 @@
                 <w:sz w:val="16"/>
                 <w:szCs w:val="16"/>
               </w:rPr>
-              <w:lastRenderedPageBreak/>
               <w:t>1BV = Zone 1, Sampling Point B, Vegetated</w:t>
             </w:r>
           </w:p>
@@ -8388,6 +8209,7 @@
                 <w:sz w:val="16"/>
                 <w:szCs w:val="16"/>
               </w:rPr>
+              <w:lastRenderedPageBreak/>
               <w:t>2</w:t>
             </w:r>
             <w:r>
@@ -10161,7 +9983,6 @@
                 <w:sz w:val="16"/>
                 <w:szCs w:val="16"/>
               </w:rPr>
-              <w:lastRenderedPageBreak/>
               <w:t>1BV = Zone 1, Sampling Point B, Vegetated</w:t>
             </w:r>
           </w:p>
@@ -10270,6 +10091,7 @@
                 <w:sz w:val="16"/>
                 <w:szCs w:val="16"/>
               </w:rPr>
+              <w:lastRenderedPageBreak/>
               <w:t>2BV = Zone 2, Sampling Point B, Vegetated</w:t>
             </w:r>
           </w:p>
@@ -11471,7 +11293,15 @@
                 <w:sz w:val="20"/>
                 <w:szCs w:val="20"/>
               </w:rPr>
-              <w:t>BubbleTrapDepth</w:t>
+              <w:t>Depth</w:t>
+            </w:r>
+            <w:r>
+              <w:rPr>
+                <w:rFonts w:asciiTheme="minorHAnsi" w:hAnsiTheme="minorHAnsi" w:cstheme="minorHAnsi"/>
+                <w:sz w:val="20"/>
+                <w:szCs w:val="20"/>
+              </w:rPr>
+              <w:t>_BT</w:t>
             </w:r>
           </w:p>
         </w:tc>
@@ -11775,16 +11605,7 @@
                 <w:sz w:val="20"/>
                 <w:szCs w:val="20"/>
               </w:rPr>
-              <w:t xml:space="preserve">based </w:t>
-            </w:r>
-            <w:r>
-              <w:rPr>
-                <w:rFonts w:asciiTheme="minorHAnsi" w:hAnsiTheme="minorHAnsi" w:cstheme="minorHAnsi"/>
-                <w:sz w:val="20"/>
-                <w:szCs w:val="20"/>
-              </w:rPr>
-              <w:lastRenderedPageBreak/>
-              <w:t>on accumulated air and deployment time</w:t>
+              <w:t>based on accumulated air and deployment time</w:t>
             </w:r>
           </w:p>
         </w:tc>
@@ -11807,7 +11628,6 @@
                 <w:sz w:val="20"/>
                 <w:szCs w:val="20"/>
               </w:rPr>
-              <w:lastRenderedPageBreak/>
               <w:t>L m</w:t>
             </w:r>
             <w:r>
@@ -12005,177 +11825,6 @@
                 <w:sz w:val="20"/>
                 <w:szCs w:val="20"/>
                 <w:vertAlign w:val="superscript"/>
-              </w:rPr>
-            </w:pPr>
-            <w:r>
-              <w:rPr>
-                <w:rFonts w:asciiTheme="minorHAnsi" w:hAnsiTheme="minorHAnsi" w:cstheme="minorHAnsi"/>
-                <w:sz w:val="20"/>
-                <w:szCs w:val="20"/>
-              </w:rPr>
-              <w:t>mg C m</w:t>
-            </w:r>
-            <w:r>
-              <w:rPr>
-                <w:rFonts w:asciiTheme="minorHAnsi" w:hAnsiTheme="minorHAnsi" w:cstheme="minorHAnsi"/>
-                <w:sz w:val="20"/>
-                <w:szCs w:val="20"/>
-                <w:vertAlign w:val="superscript"/>
-              </w:rPr>
-              <w:t>-2</w:t>
-            </w:r>
-            <w:r>
-              <w:rPr>
-                <w:rFonts w:asciiTheme="minorHAnsi" w:hAnsiTheme="minorHAnsi" w:cstheme="minorHAnsi"/>
-                <w:sz w:val="20"/>
-                <w:szCs w:val="20"/>
-              </w:rPr>
-              <w:t xml:space="preserve"> d</w:t>
-            </w:r>
-            <w:r>
-              <w:rPr>
-                <w:rFonts w:asciiTheme="minorHAnsi" w:hAnsiTheme="minorHAnsi" w:cstheme="minorHAnsi"/>
-                <w:sz w:val="20"/>
-                <w:szCs w:val="20"/>
-                <w:vertAlign w:val="superscript"/>
-              </w:rPr>
-              <w:t>-1</w:t>
-            </w:r>
-          </w:p>
-        </w:tc>
-        <w:tc>
-          <w:tcPr>
-            <w:tcW w:w="1762" w:type="dxa"/>
-          </w:tcPr>
-          <w:p>
-            <w:pPr>
-              <w:spacing w:after="0" w:line="240" w:lineRule="auto"/>
-              <w:rPr>
-                <w:rFonts w:asciiTheme="minorHAnsi" w:hAnsiTheme="minorHAnsi" w:cstheme="minorHAnsi"/>
-                <w:sz w:val="20"/>
-                <w:szCs w:val="20"/>
-              </w:rPr>
-            </w:pPr>
-          </w:p>
-        </w:tc>
-        <w:tc>
-          <w:tcPr>
-            <w:tcW w:w="1507" w:type="dxa"/>
-          </w:tcPr>
-          <w:p>
-            <w:pPr>
-              <w:spacing w:after="0" w:line="240" w:lineRule="auto"/>
-              <w:rPr>
-                <w:rFonts w:asciiTheme="minorHAnsi" w:hAnsiTheme="minorHAnsi" w:cstheme="minorHAnsi"/>
-                <w:sz w:val="20"/>
-                <w:szCs w:val="20"/>
-              </w:rPr>
-            </w:pPr>
-          </w:p>
-        </w:tc>
-        <w:tc>
-          <w:tcPr>
-            <w:tcW w:w="1028" w:type="dxa"/>
-          </w:tcPr>
-          <w:p>
-            <w:pPr>
-              <w:spacing w:after="0" w:line="240" w:lineRule="auto"/>
-              <w:rPr>
-                <w:rFonts w:asciiTheme="minorHAnsi" w:hAnsiTheme="minorHAnsi" w:cstheme="minorHAnsi"/>
-                <w:sz w:val="20"/>
-                <w:szCs w:val="20"/>
-              </w:rPr>
-            </w:pPr>
-            <w:r>
-              <w:rPr>
-                <w:rFonts w:asciiTheme="minorHAnsi" w:hAnsiTheme="minorHAnsi" w:cstheme="minorHAnsi"/>
-                <w:sz w:val="20"/>
-                <w:szCs w:val="20"/>
-              </w:rPr>
-              <w:t>NA</w:t>
-            </w:r>
-          </w:p>
-        </w:tc>
-      </w:tr>
-      <w:tr>
-        <w:trPr>
-          <w:trHeight w:val="300"/>
-        </w:trPr>
-        <w:tc>
-          <w:tcPr>
-            <w:tcW w:w="2076" w:type="dxa"/>
-            <w:noWrap/>
-          </w:tcPr>
-          <w:p>
-            <w:pPr>
-              <w:spacing w:after="0" w:line="240" w:lineRule="auto"/>
-              <w:rPr>
-                <w:rFonts w:asciiTheme="minorHAnsi" w:hAnsiTheme="minorHAnsi" w:cstheme="minorHAnsi"/>
-                <w:sz w:val="20"/>
-                <w:szCs w:val="20"/>
-              </w:rPr>
-            </w:pPr>
-            <w:r>
-              <w:rPr>
-                <w:rFonts w:asciiTheme="minorHAnsi" w:hAnsiTheme="minorHAnsi" w:cstheme="minorHAnsi"/>
-                <w:sz w:val="20"/>
-                <w:szCs w:val="20"/>
-              </w:rPr>
-              <w:t>LogEbull_CH4Flux</w:t>
-            </w:r>
-          </w:p>
-        </w:tc>
-        <w:tc>
-          <w:tcPr>
-            <w:tcW w:w="1626" w:type="dxa"/>
-          </w:tcPr>
-          <w:p>
-            <w:pPr>
-              <w:spacing w:after="0" w:line="240" w:lineRule="auto"/>
-              <w:rPr>
-                <w:rFonts w:asciiTheme="minorHAnsi" w:hAnsiTheme="minorHAnsi" w:cstheme="minorHAnsi"/>
-                <w:sz w:val="20"/>
-                <w:szCs w:val="20"/>
-              </w:rPr>
-            </w:pPr>
-            <w:r>
-              <w:rPr>
-                <w:rFonts w:asciiTheme="minorHAnsi" w:hAnsiTheme="minorHAnsi" w:cstheme="minorHAnsi"/>
-                <w:sz w:val="20"/>
-                <w:szCs w:val="20"/>
-              </w:rPr>
-              <w:t>Log-transformed ebullitive CH</w:t>
-            </w:r>
-            <w:r>
-              <w:rPr>
-                <w:rFonts w:asciiTheme="minorHAnsi" w:hAnsiTheme="minorHAnsi" w:cstheme="minorHAnsi"/>
-                <w:sz w:val="20"/>
-                <w:szCs w:val="20"/>
-                <w:vertAlign w:val="subscript"/>
-              </w:rPr>
-              <w:t>4</w:t>
-            </w:r>
-            <w:r>
-              <w:rPr>
-                <w:rFonts w:asciiTheme="minorHAnsi" w:hAnsiTheme="minorHAnsi" w:cstheme="minorHAnsi"/>
-                <w:sz w:val="20"/>
-                <w:szCs w:val="20"/>
-              </w:rPr>
-              <w:t xml:space="preserve"> flux value</w:t>
-            </w:r>
-          </w:p>
-        </w:tc>
-        <w:tc>
-          <w:tcPr>
-            <w:tcW w:w="1199" w:type="dxa"/>
-          </w:tcPr>
-          <w:p>
-            <w:pPr>
-              <w:spacing w:after="0" w:line="240" w:lineRule="auto"/>
-              <w:rPr>
-                <w:rFonts w:asciiTheme="minorHAnsi" w:hAnsiTheme="minorHAnsi" w:cstheme="minorHAnsi"/>
-                <w:sz w:val="20"/>
-                <w:szCs w:val="20"/>
               </w:rPr>
             </w:pPr>
             <w:r>
@@ -12295,6 +11944,7 @@
           <w:sz w:val="20"/>
           <w:szCs w:val="20"/>
         </w:rPr>
+        <w:lastRenderedPageBreak/>
         <w:t xml:space="preserve">Dataset filename: </w:t>
       </w:r>
       <w:r>
@@ -13547,16 +13197,7 @@
                 <w:sz w:val="20"/>
                 <w:szCs w:val="20"/>
               </w:rPr>
-              <w:t xml:space="preserve">A, B, C represents specific sampling point which contains one </w:t>
-            </w:r>
-            <w:r>
-              <w:rPr>
-                <w:rFonts w:asciiTheme="minorHAnsi" w:hAnsiTheme="minorHAnsi" w:cstheme="minorHAnsi"/>
-                <w:sz w:val="20"/>
-                <w:szCs w:val="20"/>
-              </w:rPr>
-              <w:lastRenderedPageBreak/>
-              <w:t>vegetated and one open point (i.e., AO and AV)</w:t>
+              <w:t>A, B, C represents specific sampling point which contains one vegetated and one open point (i.e., AO and AV)</w:t>
             </w:r>
           </w:p>
         </w:tc>
@@ -13790,7 +13431,16 @@
                 <w:sz w:val="20"/>
                 <w:szCs w:val="20"/>
               </w:rPr>
-              <w:t>roxy for plant productivity as defined by RGB band information</w:t>
+              <w:t xml:space="preserve">roxy for plant productivity </w:t>
+            </w:r>
+            <w:r>
+              <w:rPr>
+                <w:rFonts w:asciiTheme="minorHAnsi" w:hAnsiTheme="minorHAnsi" w:cstheme="minorHAnsi"/>
+                <w:sz w:val="20"/>
+                <w:szCs w:val="20"/>
+              </w:rPr>
+              <w:lastRenderedPageBreak/>
+              <w:t>as defined by RGB band information</w:t>
             </w:r>
           </w:p>
         </w:tc>
@@ -14544,348 +14194,6 @@
                 <w:vertAlign w:val="superscript"/>
               </w:rPr>
               <w:t>3</w:t>
-            </w:r>
-          </w:p>
-        </w:tc>
-        <w:tc>
-          <w:tcPr>
-            <w:tcW w:w="1886" w:type="dxa"/>
-          </w:tcPr>
-          <w:p>
-            <w:pPr>
-              <w:spacing w:after="0" w:line="240" w:lineRule="auto"/>
-              <w:rPr>
-                <w:rFonts w:asciiTheme="minorHAnsi" w:hAnsiTheme="minorHAnsi" w:cstheme="minorHAnsi"/>
-                <w:sz w:val="20"/>
-                <w:szCs w:val="20"/>
-              </w:rPr>
-            </w:pPr>
-          </w:p>
-        </w:tc>
-        <w:tc>
-          <w:tcPr>
-            <w:tcW w:w="1666" w:type="dxa"/>
-          </w:tcPr>
-          <w:p>
-            <w:pPr>
-              <w:spacing w:after="0" w:line="240" w:lineRule="auto"/>
-              <w:rPr>
-                <w:rFonts w:asciiTheme="minorHAnsi" w:hAnsiTheme="minorHAnsi" w:cstheme="minorHAnsi"/>
-                <w:sz w:val="20"/>
-                <w:szCs w:val="20"/>
-              </w:rPr>
-            </w:pPr>
-          </w:p>
-        </w:tc>
-        <w:tc>
-          <w:tcPr>
-            <w:tcW w:w="1067" w:type="dxa"/>
-          </w:tcPr>
-          <w:p>
-            <w:pPr>
-              <w:spacing w:after="0" w:line="240" w:lineRule="auto"/>
-              <w:rPr>
-                <w:rFonts w:asciiTheme="minorHAnsi" w:hAnsiTheme="minorHAnsi" w:cstheme="minorHAnsi"/>
-                <w:sz w:val="20"/>
-                <w:szCs w:val="20"/>
-              </w:rPr>
-            </w:pPr>
-            <w:r>
-              <w:rPr>
-                <w:rFonts w:asciiTheme="minorHAnsi" w:hAnsiTheme="minorHAnsi" w:cstheme="minorHAnsi"/>
-                <w:sz w:val="20"/>
-                <w:szCs w:val="20"/>
-              </w:rPr>
-              <w:t>NA</w:t>
-            </w:r>
-          </w:p>
-        </w:tc>
-      </w:tr>
-      <w:tr>
-        <w:trPr>
-          <w:trHeight w:val="300"/>
-        </w:trPr>
-        <w:tc>
-          <w:tcPr>
-            <w:tcW w:w="1578" w:type="dxa"/>
-            <w:noWrap/>
-          </w:tcPr>
-          <w:p>
-            <w:pPr>
-              <w:spacing w:after="0" w:line="240" w:lineRule="auto"/>
-              <w:rPr>
-                <w:rFonts w:asciiTheme="minorHAnsi" w:hAnsiTheme="minorHAnsi" w:cstheme="minorHAnsi"/>
-                <w:sz w:val="20"/>
-                <w:szCs w:val="20"/>
-              </w:rPr>
-            </w:pPr>
-            <w:r>
-              <w:rPr>
-                <w:rFonts w:asciiTheme="minorHAnsi" w:hAnsiTheme="minorHAnsi" w:cstheme="minorHAnsi"/>
-                <w:sz w:val="20"/>
-                <w:szCs w:val="20"/>
-              </w:rPr>
-              <w:t>CH4Flux</w:t>
-            </w:r>
-          </w:p>
-        </w:tc>
-        <w:tc>
-          <w:tcPr>
-            <w:tcW w:w="1681" w:type="dxa"/>
-          </w:tcPr>
-          <w:p>
-            <w:pPr>
-              <w:spacing w:after="0" w:line="240" w:lineRule="auto"/>
-              <w:rPr>
-                <w:rFonts w:asciiTheme="minorHAnsi" w:hAnsiTheme="minorHAnsi" w:cstheme="minorHAnsi"/>
-                <w:sz w:val="20"/>
-                <w:szCs w:val="20"/>
-              </w:rPr>
-            </w:pPr>
-            <w:r>
-              <w:rPr>
-                <w:rFonts w:asciiTheme="minorHAnsi" w:hAnsiTheme="minorHAnsi" w:cstheme="minorHAnsi"/>
-                <w:sz w:val="20"/>
-                <w:szCs w:val="20"/>
-              </w:rPr>
-              <w:t>Floating Chamber CH</w:t>
-            </w:r>
-            <w:r>
-              <w:rPr>
-                <w:rFonts w:asciiTheme="minorHAnsi" w:hAnsiTheme="minorHAnsi" w:cstheme="minorHAnsi"/>
-                <w:sz w:val="20"/>
-                <w:szCs w:val="20"/>
-                <w:vertAlign w:val="subscript"/>
-              </w:rPr>
-              <w:t>4</w:t>
-            </w:r>
-            <w:r>
-              <w:rPr>
-                <w:rFonts w:asciiTheme="minorHAnsi" w:hAnsiTheme="minorHAnsi" w:cstheme="minorHAnsi"/>
-                <w:sz w:val="20"/>
-                <w:szCs w:val="20"/>
-              </w:rPr>
-              <w:t xml:space="preserve"> Flux</w:t>
-            </w:r>
-          </w:p>
-        </w:tc>
-        <w:tc>
-          <w:tcPr>
-            <w:tcW w:w="1320" w:type="dxa"/>
-          </w:tcPr>
-          <w:p>
-            <w:pPr>
-              <w:spacing w:after="0" w:line="240" w:lineRule="auto"/>
-              <w:rPr>
-                <w:rFonts w:asciiTheme="minorHAnsi" w:hAnsiTheme="minorHAnsi" w:cstheme="minorHAnsi"/>
-                <w:sz w:val="20"/>
-                <w:szCs w:val="20"/>
-              </w:rPr>
-            </w:pPr>
-            <w:r>
-              <w:rPr>
-                <w:rFonts w:asciiTheme="minorHAnsi" w:hAnsiTheme="minorHAnsi" w:cstheme="minorHAnsi"/>
-                <w:sz w:val="20"/>
-                <w:szCs w:val="20"/>
-              </w:rPr>
-              <w:t>mg C m</w:t>
-            </w:r>
-            <w:r>
-              <w:rPr>
-                <w:rFonts w:asciiTheme="minorHAnsi" w:hAnsiTheme="minorHAnsi" w:cstheme="minorHAnsi"/>
-                <w:sz w:val="20"/>
-                <w:szCs w:val="20"/>
-                <w:vertAlign w:val="superscript"/>
-              </w:rPr>
-              <w:t>-2</w:t>
-            </w:r>
-            <w:r>
-              <w:rPr>
-                <w:rFonts w:asciiTheme="minorHAnsi" w:hAnsiTheme="minorHAnsi" w:cstheme="minorHAnsi"/>
-                <w:sz w:val="20"/>
-                <w:szCs w:val="20"/>
-              </w:rPr>
-              <w:t xml:space="preserve"> d</w:t>
-            </w:r>
-            <w:r>
-              <w:rPr>
-                <w:rFonts w:asciiTheme="minorHAnsi" w:hAnsiTheme="minorHAnsi" w:cstheme="minorHAnsi"/>
-                <w:sz w:val="20"/>
-                <w:szCs w:val="20"/>
-                <w:vertAlign w:val="superscript"/>
-              </w:rPr>
-              <w:t>-1</w:t>
-            </w:r>
-          </w:p>
-        </w:tc>
-        <w:tc>
-          <w:tcPr>
-            <w:tcW w:w="1886" w:type="dxa"/>
-          </w:tcPr>
-          <w:p>
-            <w:pPr>
-              <w:spacing w:after="0" w:line="240" w:lineRule="auto"/>
-              <w:rPr>
-                <w:rFonts w:asciiTheme="minorHAnsi" w:hAnsiTheme="minorHAnsi" w:cstheme="minorHAnsi"/>
-                <w:sz w:val="20"/>
-                <w:szCs w:val="20"/>
-              </w:rPr>
-            </w:pPr>
-          </w:p>
-        </w:tc>
-        <w:tc>
-          <w:tcPr>
-            <w:tcW w:w="1666" w:type="dxa"/>
-          </w:tcPr>
-          <w:p>
-            <w:pPr>
-              <w:spacing w:after="0" w:line="240" w:lineRule="auto"/>
-              <w:rPr>
-                <w:rFonts w:asciiTheme="minorHAnsi" w:hAnsiTheme="minorHAnsi" w:cstheme="minorHAnsi"/>
-                <w:sz w:val="20"/>
-                <w:szCs w:val="20"/>
-              </w:rPr>
-            </w:pPr>
-          </w:p>
-        </w:tc>
-        <w:tc>
-          <w:tcPr>
-            <w:tcW w:w="1067" w:type="dxa"/>
-          </w:tcPr>
-          <w:p>
-            <w:pPr>
-              <w:spacing w:after="0" w:line="240" w:lineRule="auto"/>
-              <w:rPr>
-                <w:rFonts w:asciiTheme="minorHAnsi" w:hAnsiTheme="minorHAnsi" w:cstheme="minorHAnsi"/>
-                <w:sz w:val="20"/>
-                <w:szCs w:val="20"/>
-              </w:rPr>
-            </w:pPr>
-            <w:r>
-              <w:rPr>
-                <w:rFonts w:asciiTheme="minorHAnsi" w:hAnsiTheme="minorHAnsi" w:cstheme="minorHAnsi"/>
-                <w:sz w:val="20"/>
-                <w:szCs w:val="20"/>
-              </w:rPr>
-              <w:t>NA</w:t>
-            </w:r>
-          </w:p>
-        </w:tc>
-      </w:tr>
-      <w:tr>
-        <w:trPr>
-          <w:trHeight w:val="300"/>
-        </w:trPr>
-        <w:tc>
-          <w:tcPr>
-            <w:tcW w:w="1578" w:type="dxa"/>
-            <w:noWrap/>
-          </w:tcPr>
-          <w:p>
-            <w:pPr>
-              <w:spacing w:after="0" w:line="240" w:lineRule="auto"/>
-              <w:rPr>
-                <w:rFonts w:asciiTheme="minorHAnsi" w:hAnsiTheme="minorHAnsi" w:cstheme="minorHAnsi"/>
-                <w:sz w:val="20"/>
-                <w:szCs w:val="20"/>
-              </w:rPr>
-            </w:pPr>
-            <w:r>
-              <w:rPr>
-                <w:rFonts w:asciiTheme="minorHAnsi" w:hAnsiTheme="minorHAnsi" w:cstheme="minorHAnsi"/>
-                <w:sz w:val="20"/>
-                <w:szCs w:val="20"/>
-              </w:rPr>
-              <w:t>PM_CH4Flux</w:t>
-            </w:r>
-          </w:p>
-        </w:tc>
-        <w:tc>
-          <w:tcPr>
-            <w:tcW w:w="1681" w:type="dxa"/>
-          </w:tcPr>
-          <w:p>
-            <w:pPr>
-              <w:spacing w:after="0" w:line="240" w:lineRule="auto"/>
-              <w:rPr>
-                <w:rFonts w:asciiTheme="minorHAnsi" w:hAnsiTheme="minorHAnsi" w:cstheme="minorHAnsi"/>
-                <w:sz w:val="20"/>
-                <w:szCs w:val="20"/>
-              </w:rPr>
-            </w:pPr>
-            <w:r>
-              <w:rPr>
-                <w:rFonts w:asciiTheme="minorHAnsi" w:hAnsiTheme="minorHAnsi" w:cstheme="minorHAnsi"/>
-                <w:sz w:val="20"/>
-                <w:szCs w:val="20"/>
-              </w:rPr>
-              <w:t>Floating Chamber CH</w:t>
-            </w:r>
-            <w:r>
-              <w:rPr>
-                <w:rFonts w:asciiTheme="minorHAnsi" w:hAnsiTheme="minorHAnsi" w:cstheme="minorHAnsi"/>
-                <w:sz w:val="20"/>
-                <w:szCs w:val="20"/>
-                <w:vertAlign w:val="subscript"/>
-              </w:rPr>
-              <w:t>4</w:t>
-            </w:r>
-            <w:r>
-              <w:rPr>
-                <w:rFonts w:asciiTheme="minorHAnsi" w:hAnsiTheme="minorHAnsi" w:cstheme="minorHAnsi"/>
-                <w:sz w:val="20"/>
-                <w:szCs w:val="20"/>
-              </w:rPr>
-              <w:t xml:space="preserve"> Flux – Plant-Mediated only</w:t>
-            </w:r>
-          </w:p>
-        </w:tc>
-        <w:tc>
-          <w:tcPr>
-            <w:tcW w:w="1320" w:type="dxa"/>
-          </w:tcPr>
-          <w:p>
-            <w:pPr>
-              <w:spacing w:after="0" w:line="240" w:lineRule="auto"/>
-              <w:rPr>
-                <w:rFonts w:asciiTheme="minorHAnsi" w:hAnsiTheme="minorHAnsi" w:cstheme="minorHAnsi"/>
-                <w:sz w:val="20"/>
-                <w:szCs w:val="20"/>
-              </w:rPr>
-            </w:pPr>
-            <w:r>
-              <w:rPr>
-                <w:rFonts w:asciiTheme="minorHAnsi" w:hAnsiTheme="minorHAnsi" w:cstheme="minorHAnsi"/>
-                <w:sz w:val="20"/>
-                <w:szCs w:val="20"/>
-              </w:rPr>
-              <w:t>mg C m</w:t>
-            </w:r>
-            <w:r>
-              <w:rPr>
-                <w:rFonts w:asciiTheme="minorHAnsi" w:hAnsiTheme="minorHAnsi" w:cstheme="minorHAnsi"/>
-                <w:sz w:val="20"/>
-                <w:szCs w:val="20"/>
-                <w:vertAlign w:val="superscript"/>
-              </w:rPr>
-              <w:t>-2</w:t>
-            </w:r>
-            <w:r>
-              <w:rPr>
-                <w:rFonts w:asciiTheme="minorHAnsi" w:hAnsiTheme="minorHAnsi" w:cstheme="minorHAnsi"/>
-                <w:sz w:val="20"/>
-                <w:szCs w:val="20"/>
-              </w:rPr>
-              <w:t xml:space="preserve"> d</w:t>
-            </w:r>
-            <w:r>
-              <w:rPr>
-                <w:rFonts w:asciiTheme="minorHAnsi" w:hAnsiTheme="minorHAnsi" w:cstheme="minorHAnsi"/>
-                <w:sz w:val="20"/>
-                <w:szCs w:val="20"/>
-                <w:vertAlign w:val="superscript"/>
-              </w:rPr>
-              <w:t>-1</w:t>
             </w:r>
           </w:p>
         </w:tc>
@@ -15177,7 +14485,6 @@
                 <w:sz w:val="20"/>
                 <w:szCs w:val="20"/>
               </w:rPr>
-              <w:lastRenderedPageBreak/>
               <w:t>Column name</w:t>
             </w:r>
           </w:p>
@@ -15656,6 +14963,7 @@
                 <w:sz w:val="16"/>
                 <w:szCs w:val="16"/>
               </w:rPr>
+              <w:lastRenderedPageBreak/>
               <w:t>2AO = Zone 2, Sampling Point A, Open</w:t>
             </w:r>
           </w:p>
@@ -16290,16 +15598,7 @@
                 <w:sz w:val="20"/>
                 <w:szCs w:val="20"/>
               </w:rPr>
-              <w:t xml:space="preserve">A, B, C represents specific sampling point which contains one </w:t>
-            </w:r>
-            <w:r>
-              <w:rPr>
-                <w:rFonts w:asciiTheme="minorHAnsi" w:hAnsiTheme="minorHAnsi" w:cstheme="minorHAnsi"/>
-                <w:sz w:val="20"/>
-                <w:szCs w:val="20"/>
-              </w:rPr>
-              <w:lastRenderedPageBreak/>
-              <w:t>vegetated and one open point (i.e., AO and AV)</w:t>
+              <w:t>A, B, C represents specific sampling point which contains one vegetated and one open point (i.e., AO and AV)</w:t>
             </w:r>
           </w:p>
         </w:tc>
@@ -16488,6 +15787,14 @@
               </w:rPr>
               <w:t>Depth</w:t>
             </w:r>
+            <w:r>
+              <w:rPr>
+                <w:rFonts w:asciiTheme="minorHAnsi" w:hAnsiTheme="minorHAnsi" w:cstheme="minorHAnsi"/>
+                <w:sz w:val="20"/>
+                <w:szCs w:val="20"/>
+              </w:rPr>
+              <w:t>_FC</w:t>
+            </w:r>
           </w:p>
         </w:tc>
         <w:tc>
@@ -16911,7 +16218,16 @@
                 <w:sz w:val="20"/>
                 <w:szCs w:val="20"/>
               </w:rPr>
-              <w:t>Electrical conductivity of surface water</w:t>
+              <w:t xml:space="preserve">Electrical conductivity </w:t>
+            </w:r>
+            <w:r>
+              <w:rPr>
+                <w:rFonts w:asciiTheme="minorHAnsi" w:hAnsiTheme="minorHAnsi" w:cstheme="minorHAnsi"/>
+                <w:sz w:val="20"/>
+                <w:szCs w:val="20"/>
+              </w:rPr>
+              <w:lastRenderedPageBreak/>
+              <w:t>of surface water</w:t>
             </w:r>
           </w:p>
         </w:tc>
@@ -16934,6 +16250,7 @@
                 <w:sz w:val="20"/>
                 <w:szCs w:val="20"/>
               </w:rPr>
+              <w:lastRenderedPageBreak/>
               <w:t>mS cm</w:t>
             </w:r>
             <w:r>
@@ -17873,16 +17190,7 @@
                 <w:sz w:val="20"/>
                 <w:szCs w:val="20"/>
               </w:rPr>
-              <w:t xml:space="preserve"> </w:t>
-            </w:r>
-            <w:r>
-              <w:rPr>
-                <w:rFonts w:asciiTheme="minorHAnsi" w:hAnsiTheme="minorHAnsi" w:cstheme="minorHAnsi"/>
-                <w:sz w:val="20"/>
-                <w:szCs w:val="20"/>
-              </w:rPr>
-              <w:lastRenderedPageBreak/>
-              <w:t>surface water temperatures as provided by HOBO loggers</w:t>
+              <w:t xml:space="preserve"> surface water temperatures as provided by HOBO loggers</w:t>
             </w:r>
           </w:p>
         </w:tc>
@@ -17905,7 +17213,6 @@
                 <w:sz w:val="20"/>
                 <w:szCs w:val="20"/>
               </w:rPr>
-              <w:lastRenderedPageBreak/>
               <w:sym w:font="Symbol" w:char="F0B0"/>
             </w:r>
             <w:r>
@@ -18292,6 +17599,7 @@
                 <w:sz w:val="20"/>
                 <w:szCs w:val="20"/>
               </w:rPr>
+              <w:lastRenderedPageBreak/>
               <w:t>HOBO_3DayBotWaterTemp</w:t>
             </w:r>
           </w:p>
@@ -19052,7 +18360,6 @@
                 <w:sz w:val="20"/>
                 <w:szCs w:val="20"/>
               </w:rPr>
-              <w:lastRenderedPageBreak/>
               <w:t>HOBO_7DaySurfWaterTemp</w:t>
             </w:r>
           </w:p>
@@ -19571,6 +18878,7 @@
                 <w:sz w:val="20"/>
                 <w:szCs w:val="20"/>
               </w:rPr>
+              <w:lastRenderedPageBreak/>
               <w:t>Column name</w:t>
             </w:r>
           </w:p>
@@ -20191,7 +19499,6 @@
                 <w:sz w:val="16"/>
                 <w:szCs w:val="16"/>
               </w:rPr>
-              <w:lastRenderedPageBreak/>
               <w:t>3</w:t>
             </w:r>
             <w:r>
@@ -20676,7 +19983,16 @@
                 <w:sz w:val="20"/>
                 <w:szCs w:val="20"/>
               </w:rPr>
-              <w:t>A, B, C represents specific sampling point which contains one vegetated and one open point (i.e., AO and AV)</w:t>
+              <w:t xml:space="preserve">A, B, C represents specific sampling point which contains one </w:t>
+            </w:r>
+            <w:r>
+              <w:rPr>
+                <w:rFonts w:asciiTheme="minorHAnsi" w:hAnsiTheme="minorHAnsi" w:cstheme="minorHAnsi"/>
+                <w:sz w:val="20"/>
+                <w:szCs w:val="20"/>
+              </w:rPr>
+              <w:lastRenderedPageBreak/>
+              <w:t>vegetated and one open point (i.e., AO and AV)</w:t>
             </w:r>
           </w:p>
         </w:tc>
@@ -21933,7 +21249,6 @@
                 <w:sz w:val="20"/>
                 <w:szCs w:val="20"/>
               </w:rPr>
-              <w:lastRenderedPageBreak/>
               <w:t xml:space="preserve">from </w:t>
             </w:r>
             <w:r>
@@ -21965,7 +21280,6 @@
                 <w:sz w:val="20"/>
                 <w:szCs w:val="20"/>
               </w:rPr>
-              <w:lastRenderedPageBreak/>
               <w:t>mg L</w:t>
             </w:r>
             <w:r>
@@ -22016,7 +21330,6 @@
                 <w:sz w:val="20"/>
                 <w:szCs w:val="20"/>
               </w:rPr>
-              <w:lastRenderedPageBreak/>
               <w:t>Red Font = below limit of detection</w:t>
             </w:r>
           </w:p>
@@ -22411,6 +21724,7 @@
                 <w:sz w:val="20"/>
                 <w:szCs w:val="20"/>
               </w:rPr>
+              <w:lastRenderedPageBreak/>
               <w:t>Red Font = below limit of detection</w:t>
             </w:r>
           </w:p>
@@ -23183,7 +22497,6 @@
                 <w:sz w:val="20"/>
                 <w:szCs w:val="20"/>
               </w:rPr>
-              <w:lastRenderedPageBreak/>
               <w:t>Red Font = below limit of detection</w:t>
             </w:r>
           </w:p>
@@ -23554,6 +22867,7 @@
                 <w:sz w:val="20"/>
                 <w:szCs w:val="20"/>
               </w:rPr>
+              <w:lastRenderedPageBreak/>
               <w:t>Red Font = below limit of detection</w:t>
             </w:r>
           </w:p>
@@ -24294,7 +23608,6 @@
                 <w:sz w:val="20"/>
                 <w:szCs w:val="20"/>
               </w:rPr>
-              <w:lastRenderedPageBreak/>
               <w:t>Red Font = below limit of detection</w:t>
             </w:r>
           </w:p>
@@ -24673,6 +23986,7 @@
                 <w:sz w:val="20"/>
                 <w:szCs w:val="20"/>
               </w:rPr>
+              <w:lastRenderedPageBreak/>
               <w:t>Red Font = below limit of detection</w:t>
             </w:r>
           </w:p>
@@ -25429,7 +24743,6 @@
                 <w:sz w:val="20"/>
                 <w:szCs w:val="20"/>
               </w:rPr>
-              <w:lastRenderedPageBreak/>
               <w:t>Red Font = below limit of detection</w:t>
             </w:r>
           </w:p>
@@ -25808,6 +25121,7 @@
                 <w:sz w:val="20"/>
                 <w:szCs w:val="20"/>
               </w:rPr>
+              <w:lastRenderedPageBreak/>
               <w:t>Red Font = below limit of detection</w:t>
             </w:r>
           </w:p>
@@ -26564,7 +25878,6 @@
                 <w:sz w:val="20"/>
                 <w:szCs w:val="20"/>
               </w:rPr>
-              <w:lastRenderedPageBreak/>
               <w:t>Red Font = below limit of detection</w:t>
             </w:r>
           </w:p>
@@ -26943,6 +26256,7 @@
                 <w:sz w:val="20"/>
                 <w:szCs w:val="20"/>
               </w:rPr>
+              <w:lastRenderedPageBreak/>
               <w:t>Red Font = below limit of detection</w:t>
             </w:r>
           </w:p>
@@ -27699,7 +27013,6 @@
                 <w:sz w:val="20"/>
                 <w:szCs w:val="20"/>
               </w:rPr>
-              <w:lastRenderedPageBreak/>
               <w:t>Red Font = below limit of detection</w:t>
             </w:r>
           </w:p>
@@ -28078,6 +27391,7 @@
                 <w:sz w:val="20"/>
                 <w:szCs w:val="20"/>
               </w:rPr>
+              <w:lastRenderedPageBreak/>
               <w:t>Red Font = below limit of detection</w:t>
             </w:r>
           </w:p>
@@ -28834,7 +28148,6 @@
                 <w:sz w:val="20"/>
                 <w:szCs w:val="20"/>
               </w:rPr>
-              <w:lastRenderedPageBreak/>
               <w:t>Red Font = below limit of detection</w:t>
             </w:r>
           </w:p>
@@ -29213,6 +28526,7 @@
                 <w:sz w:val="20"/>
                 <w:szCs w:val="20"/>
               </w:rPr>
+              <w:lastRenderedPageBreak/>
               <w:t>Red Font = below limit of detection</w:t>
             </w:r>
           </w:p>
@@ -31096,16 +30410,7 @@
                 <w:sz w:val="20"/>
                 <w:szCs w:val="20"/>
               </w:rPr>
-              <w:t xml:space="preserve"> headspace </w:t>
-            </w:r>
-            <w:r>
-              <w:rPr>
-                <w:rFonts w:asciiTheme="minorHAnsi" w:hAnsiTheme="minorHAnsi" w:cstheme="minorHAnsi"/>
-                <w:sz w:val="20"/>
-                <w:szCs w:val="20"/>
-              </w:rPr>
-              <w:lastRenderedPageBreak/>
-              <w:t>concentration</w:t>
+              <w:t xml:space="preserve"> headspace concentration</w:t>
             </w:r>
             <w:r>
               <w:rPr>
@@ -31136,7 +30441,6 @@
                 <w:sz w:val="20"/>
                 <w:szCs w:val="20"/>
               </w:rPr>
-              <w:lastRenderedPageBreak/>
               <w:t>ppb d</w:t>
             </w:r>
             <w:r>
@@ -31424,6 +30728,7 @@
                 <w:sz w:val="20"/>
                 <w:szCs w:val="20"/>
               </w:rPr>
+              <w:lastRenderedPageBreak/>
               <w:t>Log_CH4Prod</w:t>
             </w:r>
           </w:p>

</xml_diff>